<commit_message>
MOD: LoRA_adapter.py, MOD: sonnet_gen.py
</commit_message>
<xml_diff>
--- a/logs/성환/기말보고서.docx
+++ b/logs/성환/기말보고서.docx
@@ -595,9 +595,6 @@
         <w:wordWrap/>
         <w:autoSpaceDE/>
         <w:autoSpaceDN/>
-        <w:rPr>
-          <w:rFonts w:hint="eastAsia"/>
-        </w:rPr>
       </w:pPr>
       <w:r>
         <w:rPr>
@@ -620,9 +617,6 @@
         <w:wordWrap/>
         <w:autoSpaceDE/>
         <w:autoSpaceDN/>
-        <w:rPr>
-          <w:rFonts w:hint="eastAsia"/>
-        </w:rPr>
       </w:pPr>
       <w:r>
         <w:rPr>
@@ -733,9 +727,6 @@
         <w:wordWrap/>
         <w:autoSpaceDE/>
         <w:autoSpaceDN/>
-        <w:rPr>
-          <w:rFonts w:hint="eastAsia"/>
-        </w:rPr>
       </w:pPr>
       <w:r>
         <w:rPr>
@@ -809,9 +800,6 @@
         <w:wordWrap/>
         <w:autoSpaceDE/>
         <w:autoSpaceDN/>
-        <w:rPr>
-          <w:rFonts w:hint="eastAsia"/>
-        </w:rPr>
       </w:pPr>
     </w:p>
     <w:p>
@@ -820,9 +808,6 @@
         <w:wordWrap/>
         <w:autoSpaceDE/>
         <w:autoSpaceDN/>
-        <w:rPr>
-          <w:rFonts w:hint="eastAsia"/>
-        </w:rPr>
       </w:pPr>
     </w:p>
     <w:p>
@@ -832,9 +817,6 @@
         <w:autoSpaceDE/>
         <w:autoSpaceDN/>
         <w:jc w:val="left"/>
-        <w:rPr>
-          <w:rFonts w:hint="eastAsia"/>
-        </w:rPr>
       </w:pPr>
       <w:r>
         <w:br w:type="page"/>
@@ -979,14 +961,33 @@
     </w:p>
     <w:p>
       <w:pPr>
+        <w:rPr>
+          <w:rFonts w:eastAsiaTheme="minorHAnsi"/>
+          <w:b/>
+          <w:bCs/>
+          <w:szCs w:val="20"/>
+        </w:rPr>
+      </w:pPr>
+      <w:proofErr w:type="spellStart"/>
+      <w:r>
+        <w:rPr>
+          <w:rFonts w:eastAsiaTheme="minorHAnsi"/>
+          <w:b/>
+          <w:bCs/>
+          <w:szCs w:val="20"/>
+        </w:rPr>
+        <w:t>LoRA</w:t>
+      </w:r>
+      <w:proofErr w:type="spellEnd"/>
+      <w:r>
         <w:rPr>
           <w:rFonts w:eastAsiaTheme="minorHAnsi" w:hint="eastAsia"/>
           <w:b/>
           <w:bCs/>
           <w:szCs w:val="20"/>
         </w:rPr>
-      </w:pPr>
-      <w:proofErr w:type="spellStart"/>
+        <w:t xml:space="preserve"> </w:t>
+      </w:r>
       <w:r>
         <w:rPr>
           <w:rFonts w:eastAsiaTheme="minorHAnsi"/>
@@ -994,18 +995,200 @@
           <w:bCs/>
           <w:szCs w:val="20"/>
         </w:rPr>
-        <w:t>LoRA</w:t>
-      </w:r>
-      <w:proofErr w:type="spellEnd"/>
+        <w:t>수식</w:t>
+      </w:r>
+    </w:p>
+    <w:p>
+      <w:pPr>
+        <w:ind w:firstLineChars="100" w:firstLine="200"/>
+        <w:rPr>
+          <w:rFonts w:eastAsiaTheme="minorHAnsi"/>
+          <w:szCs w:val="20"/>
+        </w:rPr>
+      </w:pPr>
+      <w:proofErr w:type="spellStart"/>
+      <w:r>
+        <w:rPr>
+          <w:rFonts w:eastAsiaTheme="minorHAnsi"/>
+          <w:szCs w:val="20"/>
+        </w:rPr>
+        <w:t>W_eff</w:t>
+      </w:r>
+      <w:proofErr w:type="spellEnd"/>
+      <w:r>
+        <w:rPr>
+          <w:rFonts w:eastAsiaTheme="minorHAnsi"/>
+          <w:szCs w:val="20"/>
+        </w:rPr>
+        <w:t xml:space="preserve"> = W + (α / r) * (B @ A)</w:t>
+      </w:r>
+    </w:p>
+    <w:p>
+      <w:pPr>
+        <w:rPr>
+          <w:rFonts w:eastAsiaTheme="minorHAnsi"/>
+          <w:szCs w:val="20"/>
+        </w:rPr>
+      </w:pPr>
       <w:r>
         <w:rPr>
           <w:rFonts w:eastAsiaTheme="minorHAnsi" w:hint="eastAsia"/>
+          <w:szCs w:val="20"/>
+        </w:rPr>
+        <w:t>W</w:t>
+      </w:r>
+      <w:r>
+        <w:rPr>
+          <w:rFonts w:eastAsiaTheme="minorHAnsi"/>
+          <w:szCs w:val="20"/>
+        </w:rPr>
+        <w:t>: 기존 가중치 (학습되지 않음</w:t>
+      </w:r>
+      <w:r>
+        <w:rPr>
+          <w:rFonts w:eastAsiaTheme="minorHAnsi" w:hint="eastAsia"/>
+          <w:szCs w:val="20"/>
+        </w:rPr>
+        <w:t xml:space="preserve">), </w:t>
+      </w:r>
+      <w:r>
+        <w:rPr>
+          <w:rFonts w:eastAsiaTheme="minorHAnsi"/>
+          <w:szCs w:val="20"/>
+        </w:rPr>
+        <w:t xml:space="preserve">A ∈ </w:t>
+      </w:r>
+      <w:r>
+        <w:rPr>
+          <w:rFonts w:ascii="Cambria Math" w:eastAsiaTheme="minorHAnsi" w:hAnsi="Cambria Math" w:cs="Cambria Math"/>
+          <w:szCs w:val="20"/>
+        </w:rPr>
+        <w:t>ℝ</w:t>
+      </w:r>
+      <w:r>
+        <w:rPr>
+          <w:rFonts w:eastAsiaTheme="minorHAnsi"/>
+          <w:szCs w:val="20"/>
+        </w:rPr>
+        <w:t xml:space="preserve">^{r </w:t>
+      </w:r>
+      <w:r>
+        <w:rPr>
+          <w:rFonts w:eastAsiaTheme="minorHAnsi" w:cs="맑은 고딕" w:hint="eastAsia"/>
+          <w:szCs w:val="20"/>
+        </w:rPr>
+        <w:t>×</w:t>
+      </w:r>
+      <w:r>
+        <w:rPr>
+          <w:rFonts w:eastAsiaTheme="minorHAnsi"/>
+          <w:szCs w:val="20"/>
+        </w:rPr>
+        <w:t xml:space="preserve"> d}, B </w:t>
+      </w:r>
+      <w:r>
+        <w:rPr>
+          <w:rFonts w:eastAsiaTheme="minorHAnsi" w:cs="맑은 고딕" w:hint="eastAsia"/>
+          <w:szCs w:val="20"/>
+        </w:rPr>
+        <w:t>∈</w:t>
+      </w:r>
+      <w:r>
+        <w:rPr>
+          <w:rFonts w:eastAsiaTheme="minorHAnsi"/>
+          <w:szCs w:val="20"/>
+        </w:rPr>
+        <w:t xml:space="preserve"> </w:t>
+      </w:r>
+      <w:r>
+        <w:rPr>
+          <w:rFonts w:ascii="Cambria Math" w:eastAsiaTheme="minorHAnsi" w:hAnsi="Cambria Math" w:cs="Cambria Math"/>
+          <w:szCs w:val="20"/>
+        </w:rPr>
+        <w:t>ℝ</w:t>
+      </w:r>
+      <w:r>
+        <w:rPr>
+          <w:rFonts w:eastAsiaTheme="minorHAnsi"/>
+          <w:szCs w:val="20"/>
+        </w:rPr>
+        <w:t xml:space="preserve">^{d </w:t>
+      </w:r>
+      <w:r>
+        <w:rPr>
+          <w:rFonts w:eastAsiaTheme="minorHAnsi" w:cs="맑은 고딕" w:hint="eastAsia"/>
+          <w:szCs w:val="20"/>
+        </w:rPr>
+        <w:t>×</w:t>
+      </w:r>
+      <w:r>
+        <w:rPr>
+          <w:rFonts w:eastAsiaTheme="minorHAnsi"/>
+          <w:szCs w:val="20"/>
+        </w:rPr>
+        <w:t xml:space="preserve"> r</w:t>
+      </w:r>
+      <w:r>
+        <w:rPr>
+          <w:rFonts w:eastAsiaTheme="minorHAnsi" w:hint="eastAsia"/>
+          <w:szCs w:val="20"/>
+        </w:rPr>
+        <w:t>}</w:t>
+      </w:r>
+      <w:r>
+        <w:rPr>
+          <w:rFonts w:eastAsiaTheme="minorHAnsi" w:hint="eastAsia"/>
+          <w:szCs w:val="20"/>
+        </w:rPr>
+        <w:t xml:space="preserve">, </w:t>
+      </w:r>
+      <w:r>
+        <w:rPr>
+          <w:rFonts w:eastAsiaTheme="minorHAnsi"/>
+          <w:szCs w:val="20"/>
+        </w:rPr>
+        <w:t>α</w:t>
+      </w:r>
+      <w:r>
+        <w:rPr>
+          <w:rFonts w:eastAsiaTheme="minorHAnsi"/>
+          <w:szCs w:val="20"/>
+        </w:rPr>
+        <w:t>: scaling factor</w:t>
+      </w:r>
+      <w:r>
+        <w:rPr>
+          <w:rFonts w:eastAsiaTheme="minorHAnsi" w:hint="eastAsia"/>
+          <w:szCs w:val="20"/>
+        </w:rPr>
+        <w:t>, r</w:t>
+      </w:r>
+      <w:r>
+        <w:rPr>
+          <w:rFonts w:eastAsiaTheme="minorHAnsi"/>
+          <w:szCs w:val="20"/>
+        </w:rPr>
+        <w:t>: rank (보통 4~8 정도)</w:t>
+      </w:r>
+    </w:p>
+    <w:p>
+      <w:pPr>
+        <w:rPr>
+          <w:rFonts w:eastAsiaTheme="minorHAnsi"/>
+          <w:szCs w:val="20"/>
+        </w:rPr>
+      </w:pPr>
+    </w:p>
+    <w:p>
+      <w:pPr>
+        <w:rPr>
+          <w:rFonts w:eastAsiaTheme="minorHAnsi"/>
           <w:b/>
           <w:bCs/>
           <w:szCs w:val="20"/>
         </w:rPr>
-        <w:t xml:space="preserve"> </w:t>
-      </w:r>
+      </w:pPr>
+      <w:proofErr w:type="spellStart"/>
       <w:r>
         <w:rPr>
           <w:rFonts w:eastAsiaTheme="minorHAnsi"/>
@@ -1013,217 +1196,16 @@
           <w:bCs/>
           <w:szCs w:val="20"/>
         </w:rPr>
-        <w:t>수식</w:t>
-      </w:r>
-    </w:p>
-    <w:p>
-      <w:pPr>
-        <w:ind w:firstLineChars="100" w:firstLine="200"/>
-        <w:rPr>
-          <w:rFonts w:eastAsiaTheme="minorHAnsi"/>
-          <w:szCs w:val="20"/>
-        </w:rPr>
-      </w:pPr>
-      <w:proofErr w:type="spellStart"/>
-      <w:r>
-        <w:rPr>
-          <w:rFonts w:eastAsiaTheme="minorHAnsi"/>
-          <w:szCs w:val="20"/>
-        </w:rPr>
-        <w:t>W_eff</w:t>
-      </w:r>
-      <w:proofErr w:type="spellEnd"/>
-      <w:r>
-        <w:rPr>
-          <w:rFonts w:eastAsiaTheme="minorHAnsi"/>
-          <w:szCs w:val="20"/>
-        </w:rPr>
-        <w:t xml:space="preserve"> = W + (α / r) * (B @ A)</w:t>
-      </w:r>
-    </w:p>
-    <w:p>
-      <w:pPr>
-        <w:rPr>
-          <w:rFonts w:eastAsiaTheme="minorHAnsi"/>
-          <w:szCs w:val="20"/>
-        </w:rPr>
-      </w:pPr>
-      <w:r>
-        <w:rPr>
-          <w:rFonts w:eastAsiaTheme="minorHAnsi" w:hint="eastAsia"/>
-          <w:szCs w:val="20"/>
-        </w:rPr>
-        <w:t>W</w:t>
-      </w:r>
-      <w:r>
-        <w:rPr>
-          <w:rFonts w:eastAsiaTheme="minorHAnsi"/>
-          <w:szCs w:val="20"/>
-        </w:rPr>
-        <w:t>: 기존 가중치 (학습되지 않음</w:t>
-      </w:r>
-      <w:r>
-        <w:rPr>
-          <w:rFonts w:eastAsiaTheme="minorHAnsi" w:hint="eastAsia"/>
-          <w:szCs w:val="20"/>
-        </w:rPr>
-        <w:t xml:space="preserve">), </w:t>
-      </w:r>
-      <w:r>
-        <w:rPr>
-          <w:rFonts w:eastAsiaTheme="minorHAnsi"/>
-          <w:szCs w:val="20"/>
-        </w:rPr>
-        <w:t xml:space="preserve">A ∈ </w:t>
-      </w:r>
-      <w:r>
-        <w:rPr>
-          <w:rFonts w:ascii="Cambria Math" w:eastAsiaTheme="minorHAnsi" w:hAnsi="Cambria Math" w:cs="Cambria Math"/>
-          <w:szCs w:val="20"/>
-        </w:rPr>
-        <w:t>ℝ</w:t>
-      </w:r>
-      <w:r>
-        <w:rPr>
-          <w:rFonts w:eastAsiaTheme="minorHAnsi"/>
-          <w:szCs w:val="20"/>
-        </w:rPr>
-        <w:t xml:space="preserve">^{r </w:t>
-      </w:r>
-      <w:r>
-        <w:rPr>
-          <w:rFonts w:eastAsiaTheme="minorHAnsi" w:cs="맑은 고딕" w:hint="eastAsia"/>
-          <w:szCs w:val="20"/>
-        </w:rPr>
-        <w:t>×</w:t>
-      </w:r>
-      <w:r>
-        <w:rPr>
-          <w:rFonts w:eastAsiaTheme="minorHAnsi"/>
-          <w:szCs w:val="20"/>
-        </w:rPr>
-        <w:t xml:space="preserve"> d}, B </w:t>
-      </w:r>
-      <w:r>
-        <w:rPr>
-          <w:rFonts w:eastAsiaTheme="minorHAnsi" w:cs="맑은 고딕" w:hint="eastAsia"/>
-          <w:szCs w:val="20"/>
-        </w:rPr>
-        <w:t>∈</w:t>
-      </w:r>
-      <w:r>
-        <w:rPr>
-          <w:rFonts w:eastAsiaTheme="minorHAnsi"/>
-          <w:szCs w:val="20"/>
-        </w:rPr>
-        <w:t xml:space="preserve"> </w:t>
-      </w:r>
-      <w:r>
-        <w:rPr>
-          <w:rFonts w:ascii="Cambria Math" w:eastAsiaTheme="minorHAnsi" w:hAnsi="Cambria Math" w:cs="Cambria Math"/>
-          <w:szCs w:val="20"/>
-        </w:rPr>
-        <w:t>ℝ</w:t>
-      </w:r>
-      <w:r>
-        <w:rPr>
-          <w:rFonts w:eastAsiaTheme="minorHAnsi"/>
-          <w:szCs w:val="20"/>
-        </w:rPr>
-        <w:t xml:space="preserve">^{d </w:t>
-      </w:r>
-      <w:r>
-        <w:rPr>
-          <w:rFonts w:eastAsiaTheme="minorHAnsi" w:cs="맑은 고딕" w:hint="eastAsia"/>
-          <w:szCs w:val="20"/>
-        </w:rPr>
-        <w:t>×</w:t>
-      </w:r>
-      <w:r>
-        <w:rPr>
-          <w:rFonts w:eastAsiaTheme="minorHAnsi"/>
-          <w:szCs w:val="20"/>
-        </w:rPr>
-        <w:t xml:space="preserve"> r</w:t>
-      </w:r>
-      <w:r>
-        <w:rPr>
-          <w:rFonts w:eastAsiaTheme="minorHAnsi" w:hint="eastAsia"/>
-          <w:szCs w:val="20"/>
-        </w:rPr>
-        <w:t>}</w:t>
-      </w:r>
-      <w:r>
-        <w:rPr>
-          <w:rFonts w:eastAsiaTheme="minorHAnsi" w:hint="eastAsia"/>
-          <w:szCs w:val="20"/>
-        </w:rPr>
-        <w:t xml:space="preserve">, </w:t>
-      </w:r>
-      <w:r>
-        <w:rPr>
-          <w:rFonts w:eastAsiaTheme="minorHAnsi"/>
-          <w:szCs w:val="20"/>
-        </w:rPr>
-        <w:t>α</w:t>
-      </w:r>
-      <w:r>
-        <w:rPr>
-          <w:rFonts w:eastAsiaTheme="minorHAnsi"/>
-          <w:szCs w:val="20"/>
-        </w:rPr>
-        <w:t>: scaling factor</w:t>
-      </w:r>
-      <w:r>
-        <w:rPr>
-          <w:rFonts w:eastAsiaTheme="minorHAnsi" w:hint="eastAsia"/>
-          <w:szCs w:val="20"/>
-        </w:rPr>
-        <w:t>, r</w:t>
-      </w:r>
-      <w:r>
-        <w:rPr>
-          <w:rFonts w:eastAsiaTheme="minorHAnsi"/>
-          <w:szCs w:val="20"/>
-        </w:rPr>
-        <w:t>: rank (보통 4~8 정도)</w:t>
-      </w:r>
-    </w:p>
-    <w:p>
-      <w:pPr>
-        <w:rPr>
-          <w:rFonts w:eastAsiaTheme="minorHAnsi"/>
-          <w:szCs w:val="20"/>
-        </w:rPr>
-      </w:pPr>
-    </w:p>
-    <w:p>
-      <w:pPr>
+        <w:t>LoRALinear</w:t>
+      </w:r>
+      <w:proofErr w:type="spellEnd"/>
+      <w:r>
         <w:rPr>
           <w:rFonts w:eastAsiaTheme="minorHAnsi"/>
           <w:b/>
           <w:bCs/>
           <w:szCs w:val="20"/>
         </w:rPr>
-      </w:pPr>
-      <w:proofErr w:type="spellStart"/>
-      <w:r>
-        <w:rPr>
-          <w:rFonts w:eastAsiaTheme="minorHAnsi"/>
-          <w:b/>
-          <w:bCs/>
-          <w:szCs w:val="20"/>
-        </w:rPr>
-        <w:t>LoRALinear</w:t>
-      </w:r>
-      <w:proofErr w:type="spellEnd"/>
-      <w:r>
-        <w:rPr>
-          <w:rFonts w:eastAsiaTheme="minorHAnsi"/>
-          <w:b/>
-          <w:bCs/>
-          <w:szCs w:val="20"/>
-        </w:rPr>
         <w:t xml:space="preserve"> 클래스 구성 및 설명</w:t>
       </w:r>
     </w:p>
@@ -1295,21 +1277,12 @@
         </w:rPr>
         <w:t>”</w:t>
       </w:r>
-      <w:proofErr w:type="spellStart"/>
-      <w:r>
-        <w:rPr>
-          <w:rFonts w:eastAsiaTheme="minorHAnsi"/>
-          <w:szCs w:val="20"/>
-        </w:rPr>
-        <w:t>를</w:t>
-      </w:r>
-      <w:proofErr w:type="spellEnd"/>
-      <w:r>
-        <w:rPr>
-          <w:rFonts w:eastAsiaTheme="minorHAnsi"/>
-          <w:szCs w:val="20"/>
-        </w:rPr>
-        <w:t xml:space="preserve"> 구현</w:t>
+      <w:r>
+        <w:rPr>
+          <w:rFonts w:eastAsiaTheme="minorHAnsi"/>
+          <w:szCs w:val="20"/>
+        </w:rPr>
+        <w:t>를 구현</w:t>
       </w:r>
       <w:r>
         <w:rPr>
@@ -1646,7 +1619,7 @@
     <w:p>
       <w:pPr>
         <w:rPr>
-          <w:rFonts w:eastAsiaTheme="minorHAnsi" w:hint="eastAsia"/>
+          <w:rFonts w:eastAsiaTheme="minorHAnsi"/>
           <w:szCs w:val="20"/>
         </w:rPr>
       </w:pPr>
@@ -2431,7 +2404,7 @@
     <w:p>
       <w:pPr>
         <w:rPr>
-          <w:rFonts w:eastAsiaTheme="minorHAnsi" w:hint="eastAsia"/>
+          <w:rFonts w:eastAsiaTheme="minorHAnsi"/>
           <w:b/>
           <w:bCs/>
           <w:szCs w:val="20"/>
@@ -2968,6 +2941,9 @@
     <w:p>
       <w:pPr>
         <w:ind w:firstLineChars="100" w:firstLine="200"/>
+        <w:rPr>
+          <w:rFonts w:hint="eastAsia"/>
+        </w:rPr>
       </w:pPr>
       <w:r>
         <w:t xml:space="preserve">따라서 </w:t>
@@ -2979,6 +2955,30 @@
       <w:proofErr w:type="spellEnd"/>
       <w:r>
         <w:t>를 상위 레이어에만 적용하는 것은, 모델의 표현력에 가장 큰 영향을 주는 부분만 선택적으로 조정함으로써 효율적으로 성능을 향상시키기 위한 전략이다. 적은 수의 파라미터 조정으로도 모델의 응답 품질을 효과적으로 개선할 수 있으며, 계산 자원 역시 절감할 수 있다.</w:t>
+      </w:r>
+    </w:p>
+    <w:p>
+      <w:pPr>
+        <w:rPr>
+          <w:sz w:val="24"/>
+          <w:szCs w:val="24"/>
+        </w:rPr>
+      </w:pPr>
+      <w:r>
+        <w:rPr>
+          <w:rFonts w:hint="eastAsia"/>
+          <w:sz w:val="24"/>
+          <w:szCs w:val="24"/>
+        </w:rPr>
+        <w:lastRenderedPageBreak/>
+        <w:t xml:space="preserve"># </w:t>
+      </w:r>
+      <w:r>
+        <w:rPr>
+          <w:sz w:val="24"/>
+          <w:szCs w:val="24"/>
+        </w:rPr>
+        <w:t>1.2 Instruction Tuning</w:t>
       </w:r>
     </w:p>
     <w:p>
@@ -2988,102 +2988,500 @@
           <w:bCs/>
         </w:rPr>
       </w:pPr>
-    </w:p>
-    <w:p>
-      <w:pPr>
-        <w:rPr>
-          <w:sz w:val="24"/>
-          <w:szCs w:val="24"/>
-        </w:rPr>
-      </w:pPr>
-      <w:r>
-        <w:rPr>
-          <w:rFonts w:hint="eastAsia"/>
-          <w:sz w:val="24"/>
-          <w:szCs w:val="24"/>
-        </w:rPr>
-        <w:t xml:space="preserve"># </w:t>
-      </w:r>
-      <w:r>
-        <w:rPr>
-          <w:sz w:val="24"/>
-          <w:szCs w:val="24"/>
-        </w:rPr>
-        <w:t>1.2 Instruction Tuning</w:t>
+      <w:r>
+        <w:rPr>
+          <w:b/>
+          <w:bCs/>
+        </w:rPr>
+        <w:t>1. 개요 및 원리</w:t>
+      </w:r>
+    </w:p>
+    <w:p>
+      <w:pPr>
+        <w:ind w:firstLineChars="100" w:firstLine="200"/>
+        <w:rPr>
+          <w:rFonts w:hint="eastAsia"/>
+        </w:rPr>
+      </w:pPr>
+      <w:r>
+        <w:t xml:space="preserve">Instruction Tuning은 언어 모델이 특정 작업을 명시적으로 이해하고 수행할 수 있도록, </w:t>
+      </w:r>
+      <w:proofErr w:type="spellStart"/>
+      <w:r>
+        <w:t>지시문</w:t>
+      </w:r>
+      <w:proofErr w:type="spellEnd"/>
+      <w:r>
+        <w:t>(instruction) 형태의 프롬프트를 입력으로 제공하며 학습시키는 기법이다.</w:t>
+      </w:r>
+      <w:r>
+        <w:rPr>
+          <w:rFonts w:hint="eastAsia"/>
+        </w:rPr>
+        <w:t xml:space="preserve"> </w:t>
+      </w:r>
+      <w:r>
+        <w:t>이는 단순한 문장 생성을 넘어, 주어진 명령에 정확히 부합하는 출력을 생성하도록 모델을 학습시키는 방식의 fine-tuning이다.</w:t>
+      </w:r>
+    </w:p>
+    <w:p>
+      <w:pPr>
+        <w:ind w:firstLineChars="100" w:firstLine="200"/>
+      </w:pPr>
+      <w:r>
+        <w:t>예를 들어, GPT-2가 &lt;task=...&gt; &lt;type=...&gt;와 같은 구조화된 프롬프트를 이해할 수 있다고 가정하면, 모델은 해당 입력을 통해 어떤 작업을 수행해야 하는지 파악하며, 그에 정확히 부합하는 응답을 생성하게 된다.</w:t>
+      </w:r>
+      <w:r>
+        <w:br/>
+      </w:r>
+      <w:r>
+        <w:rPr>
+          <w:rFonts w:hint="eastAsia"/>
+        </w:rPr>
+        <w:t xml:space="preserve"> </w:t>
+      </w:r>
+      <w:r>
+        <w:t xml:space="preserve">Instruction Tuning에서는 이러한 </w:t>
+      </w:r>
+      <w:r>
+        <w:rPr>
+          <w:rFonts w:hint="eastAsia"/>
+        </w:rPr>
+        <w:t>(</w:t>
+      </w:r>
+      <w:proofErr w:type="spellStart"/>
+      <w:r>
+        <w:rPr>
+          <w:rFonts w:hint="eastAsia"/>
+        </w:rPr>
+        <w:t>지시문</w:t>
+      </w:r>
+      <w:proofErr w:type="spellEnd"/>
+      <w:r>
+        <w:rPr>
+          <w:rFonts w:hint="eastAsia"/>
+        </w:rPr>
+        <w:t>+입력)</w:t>
+      </w:r>
+      <w:r>
+        <w:t xml:space="preserve">-출력 쌍을 다수 제공함으로써, 모델이 </w:t>
+      </w:r>
+      <w:r>
+        <w:rPr>
+          <w:rFonts w:hint="eastAsia"/>
+        </w:rPr>
+        <w:t>지시문</w:t>
+      </w:r>
+      <w:r>
+        <w:t>에 조건적으로 반응하는 방식으로 학습되도록 유도한다.</w:t>
+      </w:r>
+      <w:r>
+        <w:rPr>
+          <w:rFonts w:hint="eastAsia"/>
+        </w:rPr>
+        <w:t xml:space="preserve"> </w:t>
+      </w:r>
+      <w:r>
+        <w:t xml:space="preserve">즉, </w:t>
+      </w:r>
+      <w:r>
+        <w:rPr>
+          <w:rFonts w:hint="eastAsia"/>
+        </w:rPr>
+        <w:t>지시문</w:t>
+      </w:r>
+      <w:r>
+        <w:t xml:space="preserve">에 따른 정답을 예측하도록 모델을 반복적으로 훈련함으로써, </w:t>
+      </w:r>
+      <w:proofErr w:type="spellStart"/>
+      <w:r>
+        <w:t>지시문</w:t>
+      </w:r>
+      <w:proofErr w:type="spellEnd"/>
+      <w:r>
+        <w:t xml:space="preserve"> 기반의 통제 가능한 텍스트 생성을 가능하게 한다.</w:t>
+      </w:r>
+    </w:p>
+    <w:p>
+      <w:pPr>
+        <w:rPr>
+          <w:b/>
+          <w:bCs/>
+        </w:rPr>
+      </w:pPr>
+    </w:p>
+    <w:p>
+      <w:pPr>
+        <w:rPr>
+          <w:b/>
+          <w:bCs/>
+        </w:rPr>
+      </w:pPr>
+      <w:r>
+        <w:rPr>
+          <w:b/>
+          <w:bCs/>
+        </w:rPr>
+        <w:t>2. 프롬프트의 효과: 단일 태스크에서도 의미 있는 이유</w:t>
+      </w:r>
+    </w:p>
+    <w:p>
+      <w:pPr>
+        <w:ind w:firstLineChars="100" w:firstLine="200"/>
+      </w:pPr>
+      <w:r>
+        <w:rPr>
+          <w:rFonts w:hint="eastAsia"/>
+        </w:rPr>
+        <w:t xml:space="preserve">비록 </w:t>
+      </w:r>
+      <w:r>
+        <w:t>본 모델이 Sonnet Generation이라는 단일 작업에만 사용되더라도, instruction 형태의 프롬프트를 도입하는 것은 다음과 같은 측면에서 성능 향상에 기여할 수 있다:</w:t>
+      </w:r>
+    </w:p>
+    <w:p>
+      <w:pPr>
+        <w:rPr>
+          <w:rFonts w:hint="eastAsia"/>
+        </w:rPr>
+      </w:pPr>
+      <w:r>
+        <w:rPr>
+          <w:rFonts w:hint="eastAsia"/>
+        </w:rPr>
+        <w:t>-</w:t>
+      </w:r>
+      <w:r>
+        <w:t xml:space="preserve"> </w:t>
+      </w:r>
+      <w:r>
+        <w:t>**지시문은 의미 신호(semantic signal)**로 작용하여, 출력의 스타일, 구조, 운율 등을 명확히 유도</w:t>
+      </w:r>
+      <w:r>
+        <w:rPr>
+          <w:rFonts w:hint="eastAsia"/>
+        </w:rPr>
+        <w:t>한다.</w:t>
+      </w:r>
+    </w:p>
+    <w:p>
+      <w:pPr>
+        <w:rPr>
+          <w:rFonts w:hint="eastAsia"/>
+        </w:rPr>
+      </w:pPr>
+      <w:r>
+        <w:rPr>
+          <w:rFonts w:hint="eastAsia"/>
+        </w:rPr>
+        <w:t xml:space="preserve">- </w:t>
+      </w:r>
+      <w:r>
+        <w:t>Transformer 구조 특성상 입력 초반의 프롬프트는 전체 attention 분포에 영향을 주어, 더 일관성 있고 고품질의 생성이 가능</w:t>
+      </w:r>
+      <w:r>
+        <w:rPr>
+          <w:rFonts w:hint="eastAsia"/>
+        </w:rPr>
+        <w:t>해진다.</w:t>
+      </w:r>
+    </w:p>
+    <w:p>
+      <w:pPr>
+        <w:rPr>
+          <w:rFonts w:hint="eastAsia"/>
+        </w:rPr>
+      </w:pPr>
+      <w:r>
+        <w:rPr>
+          <w:rFonts w:hint="eastAsia"/>
+        </w:rPr>
+        <w:t xml:space="preserve">- </w:t>
+      </w:r>
+      <w:r>
+        <w:t>&lt;type=</w:t>
+      </w:r>
+      <w:proofErr w:type="spellStart"/>
+      <w:r>
+        <w:t>shakespearean</w:t>
+      </w:r>
+      <w:proofErr w:type="spellEnd"/>
+      <w:r>
+        <w:t>&gt;</w:t>
+      </w:r>
+      <w:r>
+        <w:t>과 같은 지시는 학습 과정에서 **암묵적 라벨(implicit label)**로 작용하여, 학습 안정성을 높</w:t>
+      </w:r>
+      <w:r>
+        <w:rPr>
+          <w:rFonts w:hint="eastAsia"/>
+        </w:rPr>
+        <w:t>인다.</w:t>
+      </w:r>
+    </w:p>
+    <w:p/>
+    <w:p>
+      <w:r>
+        <w:t>따라서 단일 태스크만 수행하는 경우에도, 프롬프트 기반 학습은 GPT 구조의 장점을 극대화하는 효과적인 전략이 될 수 있다.</w:t>
+      </w:r>
+    </w:p>
+    <w:p>
+      <w:pPr>
+        <w:pStyle w:val="a3"/>
+        <w:ind w:leftChars="0" w:left="0"/>
+      </w:pPr>
+    </w:p>
+    <w:p>
+      <w:pPr>
+        <w:rPr>
+          <w:rFonts w:hint="eastAsia"/>
+          <w:b/>
+          <w:bCs/>
+        </w:rPr>
+      </w:pPr>
+      <w:r>
+        <w:rPr>
+          <w:rFonts w:hint="eastAsia"/>
+          <w:b/>
+          <w:bCs/>
+        </w:rPr>
+        <w:t>P</w:t>
+      </w:r>
+      <w:r>
+        <w:rPr>
+          <w:rFonts w:hint="eastAsia"/>
+          <w:b/>
+          <w:bCs/>
+        </w:rPr>
+        <w:t>rompt</w:t>
+      </w:r>
+      <w:r>
+        <w:rPr>
+          <w:b/>
+          <w:bCs/>
+        </w:rPr>
+        <w:t xml:space="preserve"> </w:t>
+      </w:r>
+      <w:r>
+        <w:rPr>
+          <w:rFonts w:hint="eastAsia"/>
+          <w:b/>
+          <w:bCs/>
+        </w:rPr>
+        <w:t>설</w:t>
+      </w:r>
+      <w:r>
+        <w:rPr>
+          <w:rFonts w:hint="eastAsia"/>
+          <w:b/>
+          <w:bCs/>
+        </w:rPr>
+        <w:t>계</w:t>
+      </w:r>
+      <w:r>
+        <w:rPr>
+          <w:rFonts w:hint="eastAsia"/>
+          <w:b/>
+          <w:bCs/>
+        </w:rPr>
+        <w:t xml:space="preserve"> (sonnet generation에서 예시)</w:t>
+      </w:r>
+    </w:p>
+    <w:p>
+      <w:proofErr w:type="spellStart"/>
+      <w:r>
+        <w:t>prompt_</w:t>
+      </w:r>
+      <w:r>
+        <w:rPr>
+          <w:rFonts w:hint="eastAsia"/>
+        </w:rPr>
+        <w:t>tokens</w:t>
+      </w:r>
+      <w:proofErr w:type="spellEnd"/>
+      <w:r>
+        <w:t xml:space="preserve"> = </w:t>
+      </w:r>
+      <w:r>
+        <w:rPr>
+          <w:rFonts w:hint="eastAsia"/>
+        </w:rPr>
+        <w:t>[</w:t>
+      </w:r>
+    </w:p>
+    <w:p>
+      <w:r>
+        <w:t>“</w:t>
+      </w:r>
+      <w:r>
+        <w:t>&lt;task=</w:t>
+      </w:r>
+      <w:proofErr w:type="spellStart"/>
+      <w:r>
+        <w:t>Sonnet_Generation</w:t>
+      </w:r>
+      <w:proofErr w:type="spellEnd"/>
+      <w:r>
+        <w:t>&gt;</w:t>
+      </w:r>
+      <w:r>
+        <w:t>”</w:t>
+      </w:r>
+      <w:r>
+        <w:rPr>
+          <w:rFonts w:hint="eastAsia"/>
+        </w:rPr>
+        <w:t>,</w:t>
+      </w:r>
+      <w:r>
+        <w:t xml:space="preserve"> </w:t>
+      </w:r>
+      <w:r>
+        <w:t>“</w:t>
+      </w:r>
+      <w:r>
+        <w:t>&lt;type=</w:t>
+      </w:r>
+      <w:proofErr w:type="spellStart"/>
+      <w:r>
+        <w:t>shakespearean</w:t>
+      </w:r>
+      <w:proofErr w:type="spellEnd"/>
+      <w:r>
+        <w:t>&gt;</w:t>
+      </w:r>
+      <w:r>
+        <w:t>”</w:t>
+      </w:r>
+      <w:r>
+        <w:rPr>
+          <w:rFonts w:hint="eastAsia"/>
+        </w:rPr>
+        <w:t xml:space="preserve">, </w:t>
+      </w:r>
+    </w:p>
+    <w:p>
+      <w:r>
+        <w:lastRenderedPageBreak/>
+        <w:t>“</w:t>
+      </w:r>
+      <w:r>
+        <w:t>&lt;meter=</w:t>
+      </w:r>
+      <w:proofErr w:type="spellStart"/>
+      <w:r>
+        <w:t>iambic_pentameter</w:t>
+      </w:r>
+      <w:proofErr w:type="spellEnd"/>
+      <w:r>
+        <w:t>&gt;</w:t>
+      </w:r>
+      <w:r>
+        <w:t>”</w:t>
+      </w:r>
+      <w:r>
+        <w:rPr>
+          <w:rFonts w:hint="eastAsia"/>
+        </w:rPr>
+        <w:t>,</w:t>
+      </w:r>
+      <w:r>
+        <w:t xml:space="preserve"> </w:t>
+      </w:r>
+      <w:r>
+        <w:t>“</w:t>
+      </w:r>
+      <w:r>
+        <w:t>&lt;rhyme=</w:t>
+      </w:r>
+      <w:proofErr w:type="spellStart"/>
+      <w:r>
+        <w:t>ababcdcdefefgg</w:t>
+      </w:r>
+      <w:proofErr w:type="spellEnd"/>
+      <w:r>
+        <w:t>&gt;"</w:t>
+      </w:r>
+    </w:p>
+    <w:p>
+      <w:pPr>
+        <w:rPr>
+          <w:rFonts w:hint="eastAsia"/>
+        </w:rPr>
+      </w:pPr>
+      <w:r>
+        <w:rPr>
+          <w:rFonts w:hint="eastAsia"/>
+        </w:rPr>
+        <w:t>]</w:t>
+      </w:r>
+    </w:p>
+    <w:p>
+      <w:r>
+        <w:t>이 구조화된 프롬프트는 다음과 같은 의미를 가진다:</w:t>
       </w:r>
     </w:p>
     <w:p>
       <w:pPr>
         <w:numPr>
           <w:ilvl w:val="0"/>
-          <w:numId w:val="6"/>
+          <w:numId w:val="26"/>
         </w:numPr>
       </w:pPr>
       <w:r>
-        <w:rPr>
-          <w:rFonts w:hint="eastAsia"/>
-        </w:rPr>
-        <w:t>기본 원리</w:t>
+        <w:t>task=</w:t>
+      </w:r>
+      <w:proofErr w:type="spellStart"/>
+      <w:r>
+        <w:t>Sonnet_Generation</w:t>
+      </w:r>
+      <w:proofErr w:type="spellEnd"/>
+      <w:r>
+        <w:t>: 모델이 시 생성 작업을 수행해야 함을 명시</w:t>
       </w:r>
     </w:p>
     <w:p>
       <w:pPr>
         <w:numPr>
           <w:ilvl w:val="0"/>
-          <w:numId w:val="6"/>
+          <w:numId w:val="26"/>
         </w:numPr>
       </w:pPr>
       <w:r>
-        <w:rPr>
-          <w:rFonts w:hint="eastAsia"/>
-        </w:rPr>
-        <w:t>개요 및 설명</w:t>
+        <w:t>type=</w:t>
+      </w:r>
+      <w:proofErr w:type="spellStart"/>
+      <w:r>
+        <w:t>shakespearean</w:t>
+      </w:r>
+      <w:proofErr w:type="spellEnd"/>
+      <w:r>
+        <w:t xml:space="preserve">: </w:t>
+      </w:r>
+      <w:proofErr w:type="spellStart"/>
+      <w:r>
+        <w:rPr>
+          <w:rFonts w:hint="eastAsia"/>
+        </w:rPr>
+        <w:t>세익스피어</w:t>
+      </w:r>
+      <w:r>
+        <w:t>식</w:t>
+      </w:r>
+      <w:proofErr w:type="spellEnd"/>
+      <w:r>
+        <w:t xml:space="preserve"> 소네트 형식을 따를 것</w:t>
       </w:r>
     </w:p>
     <w:p>
       <w:pPr>
         <w:numPr>
           <w:ilvl w:val="0"/>
-          <w:numId w:val="6"/>
+          <w:numId w:val="26"/>
         </w:numPr>
       </w:pPr>
       <w:r>
-        <w:t xml:space="preserve">instruction </w:t>
-      </w:r>
-      <w:r>
-        <w:rPr>
-          <w:rFonts w:hint="eastAsia"/>
-        </w:rPr>
-        <w:t>설계</w:t>
-      </w:r>
-    </w:p>
-    <w:p>
-      <w:r>
-        <w:t>-&gt;</w:t>
-      </w:r>
-      <w:proofErr w:type="spellStart"/>
-      <w:r>
-        <w:t>prompt_text</w:t>
-      </w:r>
-      <w:proofErr w:type="spellEnd"/>
-      <w:r>
-        <w:t xml:space="preserve"> = "&lt;task=</w:t>
-      </w:r>
-      <w:proofErr w:type="spellStart"/>
-      <w:r>
-        <w:t>Sonnet_Generation</w:t>
-      </w:r>
-      <w:proofErr w:type="spellEnd"/>
-      <w:r>
-        <w:t>&gt; &lt;type=</w:t>
-      </w:r>
-      <w:proofErr w:type="spellStart"/>
-      <w:r>
-        <w:t>spenserian</w:t>
-      </w:r>
-      <w:proofErr w:type="spellEnd"/>
-      <w:r>
-        <w:t>&gt; &lt;meter=</w:t>
+        <w:t>meter=</w:t>
       </w:r>
       <w:proofErr w:type="spellStart"/>
       <w:r>
@@ -3091,62 +3489,164 @@
       </w:r>
       <w:proofErr w:type="spellEnd"/>
       <w:r>
-        <w:t>&gt; &lt;rhyme=</w:t>
-      </w:r>
-      <w:proofErr w:type="spellStart"/>
-      <w:r>
-        <w:t>ababcdcdefefgg</w:t>
-      </w:r>
-      <w:proofErr w:type="spellEnd"/>
-      <w:r>
-        <w:t>&gt;"</w:t>
+        <w:t xml:space="preserve">: 운율은 </w:t>
+      </w:r>
+      <w:proofErr w:type="spellStart"/>
+      <w:r>
+        <w:t>약강</w:t>
+      </w:r>
+      <w:proofErr w:type="spellEnd"/>
+      <w:r>
+        <w:t xml:space="preserve"> 5보격</w:t>
       </w:r>
     </w:p>
     <w:p>
       <w:pPr>
         <w:numPr>
           <w:ilvl w:val="0"/>
-          <w:numId w:val="6"/>
+          <w:numId w:val="26"/>
         </w:numPr>
       </w:pPr>
       <w:r>
-        <w:rPr>
-          <w:rFonts w:hint="eastAsia"/>
-        </w:rPr>
-        <w:t xml:space="preserve">코드 손보기 </w:t>
-      </w:r>
-      <w:r>
-        <w:t xml:space="preserve">-&gt; </w:t>
-      </w:r>
-      <w:r>
-        <w:rPr>
-          <w:rFonts w:hint="eastAsia"/>
-        </w:rPr>
-        <w:t>데이터 셋 변경</w:t>
-      </w:r>
-      <w:r>
-        <w:t xml:space="preserve">? or input </w:t>
-      </w:r>
-      <w:r>
-        <w:rPr>
-          <w:rFonts w:hint="eastAsia"/>
-        </w:rPr>
-        <w:t>수정</w:t>
-      </w:r>
-      <w:r>
-        <w:t>?</w:t>
-      </w:r>
-    </w:p>
-    <w:p>
-      <w:r>
-        <w:t xml:space="preserve">-&gt; </w:t>
-      </w:r>
-      <w:r>
-        <w:rPr>
-          <w:rFonts w:hint="eastAsia"/>
-        </w:rPr>
-        <w:t>프롬프트 붙이기 전 과 후를 비교하기</w:t>
-      </w:r>
+        <w:t>rhyme=</w:t>
+      </w:r>
+      <w:proofErr w:type="spellStart"/>
+      <w:r>
+        <w:t>ababcdcdefefgg</w:t>
+      </w:r>
+      <w:proofErr w:type="spellEnd"/>
+      <w:r>
+        <w:t xml:space="preserve">: </w:t>
+      </w:r>
+      <w:proofErr w:type="spellStart"/>
+      <w:r>
+        <w:t>스펜서식의</w:t>
+      </w:r>
+      <w:proofErr w:type="spellEnd"/>
+      <w:r>
+        <w:t xml:space="preserve"> 라임 </w:t>
+      </w:r>
+      <w:proofErr w:type="spellStart"/>
+      <w:r>
+        <w:t>스킴을</w:t>
+      </w:r>
+      <w:proofErr w:type="spellEnd"/>
+      <w:r>
+        <w:t xml:space="preserve"> 따름</w:t>
+      </w:r>
+    </w:p>
+    <w:p>
+      <w:r>
+        <w:t>이러한 instruction 이후에 이어질 소네트를 예측하도록 학습하는 것이 Instruction Tuning의 핵심 목표이다.</w:t>
+      </w:r>
+    </w:p>
+    <w:p/>
+    <w:p>
+      <w:pPr>
+        <w:rPr>
+          <w:b/>
+          <w:bCs/>
+        </w:rPr>
+      </w:pPr>
+      <w:r>
+        <w:rPr>
+          <w:rFonts w:hint="eastAsia"/>
+          <w:b/>
+          <w:bCs/>
+        </w:rPr>
+        <w:t>유의 사항</w:t>
+      </w:r>
+    </w:p>
+    <w:p>
+      <w:r>
+        <w:rPr>
+          <w:rFonts w:hint="eastAsia"/>
+        </w:rPr>
+        <w:t>-</w:t>
+      </w:r>
+      <w:r>
+        <w:t xml:space="preserve"> </w:t>
+      </w:r>
+      <w:r>
+        <w:t xml:space="preserve">프롬프트가 </w:t>
+      </w:r>
+      <w:r>
+        <w:rPr>
+          <w:b/>
+          <w:bCs/>
+        </w:rPr>
+        <w:t>정확하고 일관되며 구조화되어야 한다</w:t>
+      </w:r>
+      <w:r>
+        <w:t xml:space="preserve">. </w:t>
+      </w:r>
+    </w:p>
+    <w:p>
+      <w:pPr>
+        <w:rPr>
+          <w:rFonts w:hint="eastAsia"/>
+        </w:rPr>
+      </w:pPr>
+      <w:r>
+        <w:t>이를 통해 모델은 "무엇을 생성할지"</w:t>
+      </w:r>
+      <w:proofErr w:type="spellStart"/>
+      <w:r>
+        <w:t>를</w:t>
+      </w:r>
+      <w:proofErr w:type="spellEnd"/>
+      <w:r>
+        <w:t xml:space="preserve"> 명확히 이해하고 따를 수 있다.</w:t>
+      </w:r>
+    </w:p>
+    <w:p/>
+    <w:p>
+      <w:pPr>
+        <w:rPr>
+          <w:b/>
+          <w:bCs/>
+        </w:rPr>
+      </w:pPr>
+      <w:r>
+        <w:rPr>
+          <w:rFonts w:hint="eastAsia"/>
+          <w:b/>
+          <w:bCs/>
+        </w:rPr>
+        <w:t>코드 설명</w:t>
+      </w:r>
+      <w:r>
+        <w:rPr>
+          <w:rFonts w:hint="eastAsia"/>
+          <w:b/>
+          <w:bCs/>
+        </w:rPr>
+        <w:t xml:space="preserve"> (sonnet generation으로 보내야 할 듯..</w:t>
+      </w:r>
+      <w:r>
+        <w:rPr>
+          <w:rFonts w:hint="eastAsia"/>
+          <w:b/>
+          <w:bCs/>
+        </w:rPr>
+        <w:t>)</w:t>
+      </w:r>
+    </w:p>
+    <w:p>
+      <w:pPr>
+        <w:rPr>
+          <w:rFonts w:hint="eastAsia"/>
+          <w:b/>
+          <w:bCs/>
+        </w:rPr>
+      </w:pPr>
+    </w:p>
+    <w:p>
+      <w:pPr>
+        <w:rPr>
+          <w:rFonts w:hint="eastAsia"/>
+        </w:rPr>
+      </w:pPr>
     </w:p>
     <w:p/>
     <w:p/>
@@ -3172,10 +3672,6 @@
     <w:p/>
     <w:p/>
     <w:p/>
-    <w:p/>
-    <w:p/>
-    <w:p/>
-    <w:p/>
     <w:p>
       <w:r>
         <w:rPr>
@@ -3332,7 +3828,6 @@
         </w:numPr>
       </w:pPr>
       <w:r>
-        <w:lastRenderedPageBreak/>
         <w:t>Lora</w:t>
       </w:r>
     </w:p>
@@ -3588,11 +4083,6 @@
       </w:r>
     </w:p>
     <w:p>
-      <w:pPr>
-        <w:rPr>
-          <w:rFonts w:hint="eastAsia"/>
-        </w:rPr>
-      </w:pPr>
       <w:r>
         <w:t xml:space="preserve">3. </w:t>
       </w:r>
@@ -3656,6 +4146,155 @@
 <file path=word/numbering.xml><?xml version="1.0" encoding="utf-8"?>
 <w:numbering xmlns:wpc="http://schemas.microsoft.com/office/word/2010/wordprocessingCanvas" xmlns:cx="http://schemas.microsoft.com/office/drawing/2014/chartex" xmlns:cx1="http://schemas.microsoft.com/office/drawing/2015/9/8/chartex" xmlns:cx2="http://schemas.microsoft.com/office/drawing/2015/10/21/chartex" xmlns:cx3="http://schemas.microsoft.com/office/drawing/2016/5/9/chartex" xmlns:cx4="http://schemas.microsoft.com/office/drawing/2016/5/10/chartex" xmlns:cx5="http://schemas.microsoft.com/office/drawing/2016/5/11/chartex" xmlns:cx6="http://schemas.microsoft.com/office/drawing/2016/5/12/chartex" xmlns:cx7="http://schemas.microsoft.com/office/drawing/2016/5/13/chartex" xmlns:cx8="http://schemas.microsoft.com/office/drawing/2016/5/14/chartex" xmlns:mc="http://schemas.openxmlformats.org/markup-compatibility/2006" xmlns:aink="http://schemas.microsoft.com/office/drawing/2016/ink" xmlns:am3d="http://schemas.microsoft.com/office/drawing/2017/model3d" xmlns:o="urn:schemas-microsoft-com:office:office" xmlns:oel="http://schemas.microsoft.com/office/2019/extlst" xmlns:r="http://schemas.openxmlformats.org/officeDocument/2006/relationships" xmlns:m="http://schemas.openxmlformats.org/officeDocument/2006/math" xmlns:v="urn:schemas-microsoft-com:vml" xmlns:wp14="http://schemas.microsoft.com/office/word/2010/wordprocessingDrawing" xmlns:wp="http://schemas.openxmlformats.org/drawingml/2006/wordprocessingDrawing" xmlns:w10="urn:schemas-microsoft-com:office:word" xmlns:w="http://schemas.openxmlformats.org/wordprocessingml/2006/main" xmlns:w14="http://schemas.microsoft.com/office/word/2010/wordml" xmlns:w15="http://schemas.microsoft.com/office/word/2012/wordml" xmlns:w16cex="http://schemas.microsoft.com/office/word/2018/wordml/cex" xmlns:w16cid="http://schemas.microsoft.com/office/word/2016/wordml/cid" xmlns:w16="http://schemas.microsoft.com/office/word/2018/wordml" xmlns:w16du="http://schemas.microsoft.com/office/word/2023/wordml/word16du" xmlns:w16sdtdh="http://schemas.microsoft.com/office/word/2020/wordml/sdtdatahash" xmlns:w16sdtfl="http://schemas.microsoft.com/office/word/2024/wordml/sdtformatlock" xmlns:w16se="http://schemas.microsoft.com/office/word/2015/wordml/symex" xmlns:wpg="http://schemas.microsoft.com/office/word/2010/wordprocessingGroup" xmlns:wpi="http://schemas.microsoft.com/office/word/2010/wordprocessingInk" xmlns:wne="http://schemas.microsoft.com/office/word/2006/wordml" xmlns:wps="http://schemas.microsoft.com/office/word/2010/wordprocessingShape" mc:Ignorable="w14 w15 w16se w16cid w16 w16cex w16sdtdh w16sdtfl w16du wp14">
   <w:abstractNum w:abstractNumId="0" w15:restartNumberingAfterBreak="0">
+    <w:nsid w:val="034653C3"/>
+    <w:multiLevelType w:val="multilevel"/>
+    <w:tmpl w:val="6B9E25A8"/>
+    <w:lvl w:ilvl="0">
+      <w:start w:val="1"/>
+      <w:numFmt w:val="bullet"/>
+      <w:lvlText w:val=""/>
+      <w:lvlJc w:val="left"/>
+      <w:pPr>
+        <w:tabs>
+          <w:tab w:val="num" w:pos="720"/>
+        </w:tabs>
+        <w:ind w:left="720" w:hanging="360"/>
+      </w:pPr>
+      <w:rPr>
+        <w:rFonts w:ascii="Symbol" w:hAnsi="Symbol" w:hint="default"/>
+        <w:sz w:val="20"/>
+      </w:rPr>
+    </w:lvl>
+    <w:lvl w:ilvl="1" w:tentative="1">
+      <w:start w:val="1"/>
+      <w:numFmt w:val="bullet"/>
+      <w:lvlText w:val="o"/>
+      <w:lvlJc w:val="left"/>
+      <w:pPr>
+        <w:tabs>
+          <w:tab w:val="num" w:pos="1440"/>
+        </w:tabs>
+        <w:ind w:left="1440" w:hanging="360"/>
+      </w:pPr>
+      <w:rPr>
+        <w:rFonts w:ascii="Courier New" w:hAnsi="Courier New" w:hint="default"/>
+        <w:sz w:val="20"/>
+      </w:rPr>
+    </w:lvl>
+    <w:lvl w:ilvl="2" w:tentative="1">
+      <w:start w:val="1"/>
+      <w:numFmt w:val="bullet"/>
+      <w:lvlText w:val=""/>
+      <w:lvlJc w:val="left"/>
+      <w:pPr>
+        <w:tabs>
+          <w:tab w:val="num" w:pos="2160"/>
+        </w:tabs>
+        <w:ind w:left="2160" w:hanging="360"/>
+      </w:pPr>
+      <w:rPr>
+        <w:rFonts w:ascii="Wingdings" w:hAnsi="Wingdings" w:hint="default"/>
+        <w:sz w:val="20"/>
+      </w:rPr>
+    </w:lvl>
+    <w:lvl w:ilvl="3" w:tentative="1">
+      <w:start w:val="1"/>
+      <w:numFmt w:val="bullet"/>
+      <w:lvlText w:val=""/>
+      <w:lvlJc w:val="left"/>
+      <w:pPr>
+        <w:tabs>
+          <w:tab w:val="num" w:pos="2880"/>
+        </w:tabs>
+        <w:ind w:left="2880" w:hanging="360"/>
+      </w:pPr>
+      <w:rPr>
+        <w:rFonts w:ascii="Wingdings" w:hAnsi="Wingdings" w:hint="default"/>
+        <w:sz w:val="20"/>
+      </w:rPr>
+    </w:lvl>
+    <w:lvl w:ilvl="4" w:tentative="1">
+      <w:start w:val="1"/>
+      <w:numFmt w:val="bullet"/>
+      <w:lvlText w:val=""/>
+      <w:lvlJc w:val="left"/>
+      <w:pPr>
+        <w:tabs>
+          <w:tab w:val="num" w:pos="3600"/>
+        </w:tabs>
+        <w:ind w:left="3600" w:hanging="360"/>
+      </w:pPr>
+      <w:rPr>
+        <w:rFonts w:ascii="Wingdings" w:hAnsi="Wingdings" w:hint="default"/>
+        <w:sz w:val="20"/>
+      </w:rPr>
+    </w:lvl>
+    <w:lvl w:ilvl="5" w:tentative="1">
+      <w:start w:val="1"/>
+      <w:numFmt w:val="bullet"/>
+      <w:lvlText w:val=""/>
+      <w:lvlJc w:val="left"/>
+      <w:pPr>
+        <w:tabs>
+          <w:tab w:val="num" w:pos="4320"/>
+        </w:tabs>
+        <w:ind w:left="4320" w:hanging="360"/>
+      </w:pPr>
+      <w:rPr>
+        <w:rFonts w:ascii="Wingdings" w:hAnsi="Wingdings" w:hint="default"/>
+        <w:sz w:val="20"/>
+      </w:rPr>
+    </w:lvl>
+    <w:lvl w:ilvl="6" w:tentative="1">
+      <w:start w:val="1"/>
+      <w:numFmt w:val="bullet"/>
+      <w:lvlText w:val=""/>
+      <w:lvlJc w:val="left"/>
+      <w:pPr>
+        <w:tabs>
+          <w:tab w:val="num" w:pos="5040"/>
+        </w:tabs>
+        <w:ind w:left="5040" w:hanging="360"/>
+      </w:pPr>
+      <w:rPr>
+        <w:rFonts w:ascii="Wingdings" w:hAnsi="Wingdings" w:hint="default"/>
+        <w:sz w:val="20"/>
+      </w:rPr>
+    </w:lvl>
+    <w:lvl w:ilvl="7" w:tentative="1">
+      <w:start w:val="1"/>
+      <w:numFmt w:val="bullet"/>
+      <w:lvlText w:val=""/>
+      <w:lvlJc w:val="left"/>
+      <w:pPr>
+        <w:tabs>
+          <w:tab w:val="num" w:pos="5760"/>
+        </w:tabs>
+        <w:ind w:left="5760" w:hanging="360"/>
+      </w:pPr>
+      <w:rPr>
+        <w:rFonts w:ascii="Wingdings" w:hAnsi="Wingdings" w:hint="default"/>
+        <w:sz w:val="20"/>
+      </w:rPr>
+    </w:lvl>
+    <w:lvl w:ilvl="8" w:tentative="1">
+      <w:start w:val="1"/>
+      <w:numFmt w:val="bullet"/>
+      <w:lvlText w:val=""/>
+      <w:lvlJc w:val="left"/>
+      <w:pPr>
+        <w:tabs>
+          <w:tab w:val="num" w:pos="6480"/>
+        </w:tabs>
+        <w:ind w:left="6480" w:hanging="360"/>
+      </w:pPr>
+      <w:rPr>
+        <w:rFonts w:ascii="Wingdings" w:hAnsi="Wingdings" w:hint="default"/>
+        <w:sz w:val="20"/>
+      </w:rPr>
+    </w:lvl>
+  </w:abstractNum>
+  <w:abstractNum w:abstractNumId="1" w15:restartNumberingAfterBreak="0">
     <w:nsid w:val="05DE451B"/>
     <w:multiLevelType w:val="hybridMultilevel"/>
     <w:tmpl w:val="C1A08FD2"/>
@@ -3744,7 +4383,305 @@
       </w:pPr>
     </w:lvl>
   </w:abstractNum>
-  <w:abstractNum w:abstractNumId="1" w15:restartNumberingAfterBreak="0">
+  <w:abstractNum w:abstractNumId="2" w15:restartNumberingAfterBreak="0">
+    <w:nsid w:val="14652B27"/>
+    <w:multiLevelType w:val="multilevel"/>
+    <w:tmpl w:val="7A2EB270"/>
+    <w:lvl w:ilvl="0">
+      <w:start w:val="1"/>
+      <w:numFmt w:val="bullet"/>
+      <w:lvlText w:val=""/>
+      <w:lvlJc w:val="left"/>
+      <w:pPr>
+        <w:tabs>
+          <w:tab w:val="num" w:pos="720"/>
+        </w:tabs>
+        <w:ind w:left="720" w:hanging="360"/>
+      </w:pPr>
+      <w:rPr>
+        <w:rFonts w:ascii="Symbol" w:hAnsi="Symbol" w:hint="default"/>
+        <w:sz w:val="20"/>
+      </w:rPr>
+    </w:lvl>
+    <w:lvl w:ilvl="1" w:tentative="1">
+      <w:start w:val="1"/>
+      <w:numFmt w:val="bullet"/>
+      <w:lvlText w:val="o"/>
+      <w:lvlJc w:val="left"/>
+      <w:pPr>
+        <w:tabs>
+          <w:tab w:val="num" w:pos="1440"/>
+        </w:tabs>
+        <w:ind w:left="1440" w:hanging="360"/>
+      </w:pPr>
+      <w:rPr>
+        <w:rFonts w:ascii="Courier New" w:hAnsi="Courier New" w:hint="default"/>
+        <w:sz w:val="20"/>
+      </w:rPr>
+    </w:lvl>
+    <w:lvl w:ilvl="2" w:tentative="1">
+      <w:start w:val="1"/>
+      <w:numFmt w:val="bullet"/>
+      <w:lvlText w:val=""/>
+      <w:lvlJc w:val="left"/>
+      <w:pPr>
+        <w:tabs>
+          <w:tab w:val="num" w:pos="2160"/>
+        </w:tabs>
+        <w:ind w:left="2160" w:hanging="360"/>
+      </w:pPr>
+      <w:rPr>
+        <w:rFonts w:ascii="Wingdings" w:hAnsi="Wingdings" w:hint="default"/>
+        <w:sz w:val="20"/>
+      </w:rPr>
+    </w:lvl>
+    <w:lvl w:ilvl="3" w:tentative="1">
+      <w:start w:val="1"/>
+      <w:numFmt w:val="bullet"/>
+      <w:lvlText w:val=""/>
+      <w:lvlJc w:val="left"/>
+      <w:pPr>
+        <w:tabs>
+          <w:tab w:val="num" w:pos="2880"/>
+        </w:tabs>
+        <w:ind w:left="2880" w:hanging="360"/>
+      </w:pPr>
+      <w:rPr>
+        <w:rFonts w:ascii="Wingdings" w:hAnsi="Wingdings" w:hint="default"/>
+        <w:sz w:val="20"/>
+      </w:rPr>
+    </w:lvl>
+    <w:lvl w:ilvl="4" w:tentative="1">
+      <w:start w:val="1"/>
+      <w:numFmt w:val="bullet"/>
+      <w:lvlText w:val=""/>
+      <w:lvlJc w:val="left"/>
+      <w:pPr>
+        <w:tabs>
+          <w:tab w:val="num" w:pos="3600"/>
+        </w:tabs>
+        <w:ind w:left="3600" w:hanging="360"/>
+      </w:pPr>
+      <w:rPr>
+        <w:rFonts w:ascii="Wingdings" w:hAnsi="Wingdings" w:hint="default"/>
+        <w:sz w:val="20"/>
+      </w:rPr>
+    </w:lvl>
+    <w:lvl w:ilvl="5" w:tentative="1">
+      <w:start w:val="1"/>
+      <w:numFmt w:val="bullet"/>
+      <w:lvlText w:val=""/>
+      <w:lvlJc w:val="left"/>
+      <w:pPr>
+        <w:tabs>
+          <w:tab w:val="num" w:pos="4320"/>
+        </w:tabs>
+        <w:ind w:left="4320" w:hanging="360"/>
+      </w:pPr>
+      <w:rPr>
+        <w:rFonts w:ascii="Wingdings" w:hAnsi="Wingdings" w:hint="default"/>
+        <w:sz w:val="20"/>
+      </w:rPr>
+    </w:lvl>
+    <w:lvl w:ilvl="6" w:tentative="1">
+      <w:start w:val="1"/>
+      <w:numFmt w:val="bullet"/>
+      <w:lvlText w:val=""/>
+      <w:lvlJc w:val="left"/>
+      <w:pPr>
+        <w:tabs>
+          <w:tab w:val="num" w:pos="5040"/>
+        </w:tabs>
+        <w:ind w:left="5040" w:hanging="360"/>
+      </w:pPr>
+      <w:rPr>
+        <w:rFonts w:ascii="Wingdings" w:hAnsi="Wingdings" w:hint="default"/>
+        <w:sz w:val="20"/>
+      </w:rPr>
+    </w:lvl>
+    <w:lvl w:ilvl="7" w:tentative="1">
+      <w:start w:val="1"/>
+      <w:numFmt w:val="bullet"/>
+      <w:lvlText w:val=""/>
+      <w:lvlJc w:val="left"/>
+      <w:pPr>
+        <w:tabs>
+          <w:tab w:val="num" w:pos="5760"/>
+        </w:tabs>
+        <w:ind w:left="5760" w:hanging="360"/>
+      </w:pPr>
+      <w:rPr>
+        <w:rFonts w:ascii="Wingdings" w:hAnsi="Wingdings" w:hint="default"/>
+        <w:sz w:val="20"/>
+      </w:rPr>
+    </w:lvl>
+    <w:lvl w:ilvl="8" w:tentative="1">
+      <w:start w:val="1"/>
+      <w:numFmt w:val="bullet"/>
+      <w:lvlText w:val=""/>
+      <w:lvlJc w:val="left"/>
+      <w:pPr>
+        <w:tabs>
+          <w:tab w:val="num" w:pos="6480"/>
+        </w:tabs>
+        <w:ind w:left="6480" w:hanging="360"/>
+      </w:pPr>
+      <w:rPr>
+        <w:rFonts w:ascii="Wingdings" w:hAnsi="Wingdings" w:hint="default"/>
+        <w:sz w:val="20"/>
+      </w:rPr>
+    </w:lvl>
+  </w:abstractNum>
+  <w:abstractNum w:abstractNumId="3" w15:restartNumberingAfterBreak="0">
+    <w:nsid w:val="154D6397"/>
+    <w:multiLevelType w:val="multilevel"/>
+    <w:tmpl w:val="A2A29EC2"/>
+    <w:lvl w:ilvl="0">
+      <w:start w:val="1"/>
+      <w:numFmt w:val="bullet"/>
+      <w:lvlText w:val=""/>
+      <w:lvlJc w:val="left"/>
+      <w:pPr>
+        <w:tabs>
+          <w:tab w:val="num" w:pos="720"/>
+        </w:tabs>
+        <w:ind w:left="720" w:hanging="360"/>
+      </w:pPr>
+      <w:rPr>
+        <w:rFonts w:ascii="Symbol" w:hAnsi="Symbol" w:hint="default"/>
+        <w:sz w:val="20"/>
+      </w:rPr>
+    </w:lvl>
+    <w:lvl w:ilvl="1" w:tentative="1">
+      <w:start w:val="1"/>
+      <w:numFmt w:val="bullet"/>
+      <w:lvlText w:val="o"/>
+      <w:lvlJc w:val="left"/>
+      <w:pPr>
+        <w:tabs>
+          <w:tab w:val="num" w:pos="1440"/>
+        </w:tabs>
+        <w:ind w:left="1440" w:hanging="360"/>
+      </w:pPr>
+      <w:rPr>
+        <w:rFonts w:ascii="Courier New" w:hAnsi="Courier New" w:hint="default"/>
+        <w:sz w:val="20"/>
+      </w:rPr>
+    </w:lvl>
+    <w:lvl w:ilvl="2" w:tentative="1">
+      <w:start w:val="1"/>
+      <w:numFmt w:val="bullet"/>
+      <w:lvlText w:val=""/>
+      <w:lvlJc w:val="left"/>
+      <w:pPr>
+        <w:tabs>
+          <w:tab w:val="num" w:pos="2160"/>
+        </w:tabs>
+        <w:ind w:left="2160" w:hanging="360"/>
+      </w:pPr>
+      <w:rPr>
+        <w:rFonts w:ascii="Wingdings" w:hAnsi="Wingdings" w:hint="default"/>
+        <w:sz w:val="20"/>
+      </w:rPr>
+    </w:lvl>
+    <w:lvl w:ilvl="3" w:tentative="1">
+      <w:start w:val="1"/>
+      <w:numFmt w:val="bullet"/>
+      <w:lvlText w:val=""/>
+      <w:lvlJc w:val="left"/>
+      <w:pPr>
+        <w:tabs>
+          <w:tab w:val="num" w:pos="2880"/>
+        </w:tabs>
+        <w:ind w:left="2880" w:hanging="360"/>
+      </w:pPr>
+      <w:rPr>
+        <w:rFonts w:ascii="Wingdings" w:hAnsi="Wingdings" w:hint="default"/>
+        <w:sz w:val="20"/>
+      </w:rPr>
+    </w:lvl>
+    <w:lvl w:ilvl="4" w:tentative="1">
+      <w:start w:val="1"/>
+      <w:numFmt w:val="bullet"/>
+      <w:lvlText w:val=""/>
+      <w:lvlJc w:val="left"/>
+      <w:pPr>
+        <w:tabs>
+          <w:tab w:val="num" w:pos="3600"/>
+        </w:tabs>
+        <w:ind w:left="3600" w:hanging="360"/>
+      </w:pPr>
+      <w:rPr>
+        <w:rFonts w:ascii="Wingdings" w:hAnsi="Wingdings" w:hint="default"/>
+        <w:sz w:val="20"/>
+      </w:rPr>
+    </w:lvl>
+    <w:lvl w:ilvl="5" w:tentative="1">
+      <w:start w:val="1"/>
+      <w:numFmt w:val="bullet"/>
+      <w:lvlText w:val=""/>
+      <w:lvlJc w:val="left"/>
+      <w:pPr>
+        <w:tabs>
+          <w:tab w:val="num" w:pos="4320"/>
+        </w:tabs>
+        <w:ind w:left="4320" w:hanging="360"/>
+      </w:pPr>
+      <w:rPr>
+        <w:rFonts w:ascii="Wingdings" w:hAnsi="Wingdings" w:hint="default"/>
+        <w:sz w:val="20"/>
+      </w:rPr>
+    </w:lvl>
+    <w:lvl w:ilvl="6" w:tentative="1">
+      <w:start w:val="1"/>
+      <w:numFmt w:val="bullet"/>
+      <w:lvlText w:val=""/>
+      <w:lvlJc w:val="left"/>
+      <w:pPr>
+        <w:tabs>
+          <w:tab w:val="num" w:pos="5040"/>
+        </w:tabs>
+        <w:ind w:left="5040" w:hanging="360"/>
+      </w:pPr>
+      <w:rPr>
+        <w:rFonts w:ascii="Wingdings" w:hAnsi="Wingdings" w:hint="default"/>
+        <w:sz w:val="20"/>
+      </w:rPr>
+    </w:lvl>
+    <w:lvl w:ilvl="7" w:tentative="1">
+      <w:start w:val="1"/>
+      <w:numFmt w:val="bullet"/>
+      <w:lvlText w:val=""/>
+      <w:lvlJc w:val="left"/>
+      <w:pPr>
+        <w:tabs>
+          <w:tab w:val="num" w:pos="5760"/>
+        </w:tabs>
+        <w:ind w:left="5760" w:hanging="360"/>
+      </w:pPr>
+      <w:rPr>
+        <w:rFonts w:ascii="Wingdings" w:hAnsi="Wingdings" w:hint="default"/>
+        <w:sz w:val="20"/>
+      </w:rPr>
+    </w:lvl>
+    <w:lvl w:ilvl="8" w:tentative="1">
+      <w:start w:val="1"/>
+      <w:numFmt w:val="bullet"/>
+      <w:lvlText w:val=""/>
+      <w:lvlJc w:val="left"/>
+      <w:pPr>
+        <w:tabs>
+          <w:tab w:val="num" w:pos="6480"/>
+        </w:tabs>
+        <w:ind w:left="6480" w:hanging="360"/>
+      </w:pPr>
+      <w:rPr>
+        <w:rFonts w:ascii="Wingdings" w:hAnsi="Wingdings" w:hint="default"/>
+        <w:sz w:val="20"/>
+      </w:rPr>
+    </w:lvl>
+  </w:abstractNum>
+  <w:abstractNum w:abstractNumId="4" w15:restartNumberingAfterBreak="0">
     <w:nsid w:val="1B0953C7"/>
     <w:multiLevelType w:val="multilevel"/>
     <w:tmpl w:val="69E8516E"/>
@@ -3843,7 +4780,7 @@
       </w:pPr>
     </w:lvl>
   </w:abstractNum>
-  <w:abstractNum w:abstractNumId="2" w15:restartNumberingAfterBreak="0">
+  <w:abstractNum w:abstractNumId="5" w15:restartNumberingAfterBreak="0">
     <w:nsid w:val="20D41161"/>
     <w:multiLevelType w:val="hybridMultilevel"/>
     <w:tmpl w:val="B8D694DC"/>
@@ -3932,7 +4869,7 @@
       </w:pPr>
     </w:lvl>
   </w:abstractNum>
-  <w:abstractNum w:abstractNumId="3" w15:restartNumberingAfterBreak="0">
+  <w:abstractNum w:abstractNumId="6" w15:restartNumberingAfterBreak="0">
     <w:nsid w:val="20E05A33"/>
     <w:multiLevelType w:val="hybridMultilevel"/>
     <w:tmpl w:val="F47035E0"/>
@@ -4021,7 +4958,7 @@
       </w:pPr>
     </w:lvl>
   </w:abstractNum>
-  <w:abstractNum w:abstractNumId="4" w15:restartNumberingAfterBreak="0">
+  <w:abstractNum w:abstractNumId="7" w15:restartNumberingAfterBreak="0">
     <w:nsid w:val="31205527"/>
     <w:multiLevelType w:val="multilevel"/>
     <w:tmpl w:val="E62EF13A"/>
@@ -4170,7 +5107,7 @@
       </w:rPr>
     </w:lvl>
   </w:abstractNum>
-  <w:abstractNum w:abstractNumId="5" w15:restartNumberingAfterBreak="0">
+  <w:abstractNum w:abstractNumId="8" w15:restartNumberingAfterBreak="0">
     <w:nsid w:val="33CA0281"/>
     <w:multiLevelType w:val="multilevel"/>
     <w:tmpl w:val="8A3ED1E4"/>
@@ -4269,7 +5206,7 @@
       </w:pPr>
     </w:lvl>
   </w:abstractNum>
-  <w:abstractNum w:abstractNumId="6" w15:restartNumberingAfterBreak="0">
+  <w:abstractNum w:abstractNumId="9" w15:restartNumberingAfterBreak="0">
     <w:nsid w:val="3468494E"/>
     <w:multiLevelType w:val="hybridMultilevel"/>
     <w:tmpl w:val="0682FD30"/>
@@ -4382,7 +5319,7 @@
       </w:rPr>
     </w:lvl>
   </w:abstractNum>
-  <w:abstractNum w:abstractNumId="7" w15:restartNumberingAfterBreak="0">
+  <w:abstractNum w:abstractNumId="10" w15:restartNumberingAfterBreak="0">
     <w:nsid w:val="3751693D"/>
     <w:multiLevelType w:val="multilevel"/>
     <w:tmpl w:val="418292EC"/>
@@ -4531,7 +5468,7 @@
       </w:rPr>
     </w:lvl>
   </w:abstractNum>
-  <w:abstractNum w:abstractNumId="8" w15:restartNumberingAfterBreak="0">
+  <w:abstractNum w:abstractNumId="11" w15:restartNumberingAfterBreak="0">
     <w:nsid w:val="3A672E1B"/>
     <w:multiLevelType w:val="hybridMultilevel"/>
     <w:tmpl w:val="B7500662"/>
@@ -4620,7 +5557,7 @@
       </w:pPr>
     </w:lvl>
   </w:abstractNum>
-  <w:abstractNum w:abstractNumId="9" w15:restartNumberingAfterBreak="0">
+  <w:abstractNum w:abstractNumId="12" w15:restartNumberingAfterBreak="0">
     <w:nsid w:val="3BE17907"/>
     <w:multiLevelType w:val="hybridMultilevel"/>
     <w:tmpl w:val="8766F50E"/>
@@ -4734,7 +5671,7 @@
       </w:pPr>
     </w:lvl>
   </w:abstractNum>
-  <w:abstractNum w:abstractNumId="10" w15:restartNumberingAfterBreak="0">
+  <w:abstractNum w:abstractNumId="13" w15:restartNumberingAfterBreak="0">
     <w:nsid w:val="3D371D0E"/>
     <w:multiLevelType w:val="multilevel"/>
     <w:tmpl w:val="AFD048E2"/>
@@ -4833,7 +5770,156 @@
       </w:pPr>
     </w:lvl>
   </w:abstractNum>
-  <w:abstractNum w:abstractNumId="11" w15:restartNumberingAfterBreak="0">
+  <w:abstractNum w:abstractNumId="14" w15:restartNumberingAfterBreak="0">
+    <w:nsid w:val="47856EF6"/>
+    <w:multiLevelType w:val="multilevel"/>
+    <w:tmpl w:val="246A4D54"/>
+    <w:lvl w:ilvl="0">
+      <w:start w:val="1"/>
+      <w:numFmt w:val="bullet"/>
+      <w:lvlText w:val=""/>
+      <w:lvlJc w:val="left"/>
+      <w:pPr>
+        <w:tabs>
+          <w:tab w:val="num" w:pos="720"/>
+        </w:tabs>
+        <w:ind w:left="720" w:hanging="360"/>
+      </w:pPr>
+      <w:rPr>
+        <w:rFonts w:ascii="Symbol" w:hAnsi="Symbol" w:hint="default"/>
+        <w:sz w:val="20"/>
+      </w:rPr>
+    </w:lvl>
+    <w:lvl w:ilvl="1" w:tentative="1">
+      <w:start w:val="1"/>
+      <w:numFmt w:val="bullet"/>
+      <w:lvlText w:val="o"/>
+      <w:lvlJc w:val="left"/>
+      <w:pPr>
+        <w:tabs>
+          <w:tab w:val="num" w:pos="1440"/>
+        </w:tabs>
+        <w:ind w:left="1440" w:hanging="360"/>
+      </w:pPr>
+      <w:rPr>
+        <w:rFonts w:ascii="Courier New" w:hAnsi="Courier New" w:hint="default"/>
+        <w:sz w:val="20"/>
+      </w:rPr>
+    </w:lvl>
+    <w:lvl w:ilvl="2" w:tentative="1">
+      <w:start w:val="1"/>
+      <w:numFmt w:val="bullet"/>
+      <w:lvlText w:val=""/>
+      <w:lvlJc w:val="left"/>
+      <w:pPr>
+        <w:tabs>
+          <w:tab w:val="num" w:pos="2160"/>
+        </w:tabs>
+        <w:ind w:left="2160" w:hanging="360"/>
+      </w:pPr>
+      <w:rPr>
+        <w:rFonts w:ascii="Wingdings" w:hAnsi="Wingdings" w:hint="default"/>
+        <w:sz w:val="20"/>
+      </w:rPr>
+    </w:lvl>
+    <w:lvl w:ilvl="3" w:tentative="1">
+      <w:start w:val="1"/>
+      <w:numFmt w:val="bullet"/>
+      <w:lvlText w:val=""/>
+      <w:lvlJc w:val="left"/>
+      <w:pPr>
+        <w:tabs>
+          <w:tab w:val="num" w:pos="2880"/>
+        </w:tabs>
+        <w:ind w:left="2880" w:hanging="360"/>
+      </w:pPr>
+      <w:rPr>
+        <w:rFonts w:ascii="Wingdings" w:hAnsi="Wingdings" w:hint="default"/>
+        <w:sz w:val="20"/>
+      </w:rPr>
+    </w:lvl>
+    <w:lvl w:ilvl="4" w:tentative="1">
+      <w:start w:val="1"/>
+      <w:numFmt w:val="bullet"/>
+      <w:lvlText w:val=""/>
+      <w:lvlJc w:val="left"/>
+      <w:pPr>
+        <w:tabs>
+          <w:tab w:val="num" w:pos="3600"/>
+        </w:tabs>
+        <w:ind w:left="3600" w:hanging="360"/>
+      </w:pPr>
+      <w:rPr>
+        <w:rFonts w:ascii="Wingdings" w:hAnsi="Wingdings" w:hint="default"/>
+        <w:sz w:val="20"/>
+      </w:rPr>
+    </w:lvl>
+    <w:lvl w:ilvl="5" w:tentative="1">
+      <w:start w:val="1"/>
+      <w:numFmt w:val="bullet"/>
+      <w:lvlText w:val=""/>
+      <w:lvlJc w:val="left"/>
+      <w:pPr>
+        <w:tabs>
+          <w:tab w:val="num" w:pos="4320"/>
+        </w:tabs>
+        <w:ind w:left="4320" w:hanging="360"/>
+      </w:pPr>
+      <w:rPr>
+        <w:rFonts w:ascii="Wingdings" w:hAnsi="Wingdings" w:hint="default"/>
+        <w:sz w:val="20"/>
+      </w:rPr>
+    </w:lvl>
+    <w:lvl w:ilvl="6" w:tentative="1">
+      <w:start w:val="1"/>
+      <w:numFmt w:val="bullet"/>
+      <w:lvlText w:val=""/>
+      <w:lvlJc w:val="left"/>
+      <w:pPr>
+        <w:tabs>
+          <w:tab w:val="num" w:pos="5040"/>
+        </w:tabs>
+        <w:ind w:left="5040" w:hanging="360"/>
+      </w:pPr>
+      <w:rPr>
+        <w:rFonts w:ascii="Wingdings" w:hAnsi="Wingdings" w:hint="default"/>
+        <w:sz w:val="20"/>
+      </w:rPr>
+    </w:lvl>
+    <w:lvl w:ilvl="7" w:tentative="1">
+      <w:start w:val="1"/>
+      <w:numFmt w:val="bullet"/>
+      <w:lvlText w:val=""/>
+      <w:lvlJc w:val="left"/>
+      <w:pPr>
+        <w:tabs>
+          <w:tab w:val="num" w:pos="5760"/>
+        </w:tabs>
+        <w:ind w:left="5760" w:hanging="360"/>
+      </w:pPr>
+      <w:rPr>
+        <w:rFonts w:ascii="Wingdings" w:hAnsi="Wingdings" w:hint="default"/>
+        <w:sz w:val="20"/>
+      </w:rPr>
+    </w:lvl>
+    <w:lvl w:ilvl="8" w:tentative="1">
+      <w:start w:val="1"/>
+      <w:numFmt w:val="bullet"/>
+      <w:lvlText w:val=""/>
+      <w:lvlJc w:val="left"/>
+      <w:pPr>
+        <w:tabs>
+          <w:tab w:val="num" w:pos="6480"/>
+        </w:tabs>
+        <w:ind w:left="6480" w:hanging="360"/>
+      </w:pPr>
+      <w:rPr>
+        <w:rFonts w:ascii="Wingdings" w:hAnsi="Wingdings" w:hint="default"/>
+        <w:sz w:val="20"/>
+      </w:rPr>
+    </w:lvl>
+  </w:abstractNum>
+  <w:abstractNum w:abstractNumId="15" w15:restartNumberingAfterBreak="0">
     <w:nsid w:val="4CEE004D"/>
     <w:multiLevelType w:val="multilevel"/>
     <w:tmpl w:val="946427F0"/>
@@ -4946,7 +6032,265 @@
       </w:pPr>
     </w:lvl>
   </w:abstractNum>
-  <w:abstractNum w:abstractNumId="12" w15:restartNumberingAfterBreak="0">
+  <w:abstractNum w:abstractNumId="16" w15:restartNumberingAfterBreak="0">
+    <w:nsid w:val="4FE30A60"/>
+    <w:multiLevelType w:val="multilevel"/>
+    <w:tmpl w:val="ECF05140"/>
+    <w:lvl w:ilvl="0">
+      <w:start w:val="1"/>
+      <w:numFmt w:val="bullet"/>
+      <w:lvlText w:val=""/>
+      <w:lvlJc w:val="left"/>
+      <w:pPr>
+        <w:tabs>
+          <w:tab w:val="num" w:pos="720"/>
+        </w:tabs>
+        <w:ind w:left="720" w:hanging="360"/>
+      </w:pPr>
+      <w:rPr>
+        <w:rFonts w:ascii="Symbol" w:hAnsi="Symbol" w:hint="default"/>
+        <w:sz w:val="20"/>
+      </w:rPr>
+    </w:lvl>
+    <w:lvl w:ilvl="1">
+      <w:start w:val="3"/>
+      <w:numFmt w:val="decimal"/>
+      <w:lvlText w:val="%2."/>
+      <w:lvlJc w:val="left"/>
+      <w:pPr>
+        <w:ind w:left="1440" w:hanging="360"/>
+      </w:pPr>
+      <w:rPr>
+        <w:rFonts w:hint="default"/>
+      </w:rPr>
+    </w:lvl>
+    <w:lvl w:ilvl="2" w:tentative="1">
+      <w:start w:val="1"/>
+      <w:numFmt w:val="bullet"/>
+      <w:lvlText w:val=""/>
+      <w:lvlJc w:val="left"/>
+      <w:pPr>
+        <w:tabs>
+          <w:tab w:val="num" w:pos="2160"/>
+        </w:tabs>
+        <w:ind w:left="2160" w:hanging="360"/>
+      </w:pPr>
+      <w:rPr>
+        <w:rFonts w:ascii="Wingdings" w:hAnsi="Wingdings" w:hint="default"/>
+        <w:sz w:val="20"/>
+      </w:rPr>
+    </w:lvl>
+    <w:lvl w:ilvl="3" w:tentative="1">
+      <w:start w:val="1"/>
+      <w:numFmt w:val="bullet"/>
+      <w:lvlText w:val=""/>
+      <w:lvlJc w:val="left"/>
+      <w:pPr>
+        <w:tabs>
+          <w:tab w:val="num" w:pos="2880"/>
+        </w:tabs>
+        <w:ind w:left="2880" w:hanging="360"/>
+      </w:pPr>
+      <w:rPr>
+        <w:rFonts w:ascii="Wingdings" w:hAnsi="Wingdings" w:hint="default"/>
+        <w:sz w:val="20"/>
+      </w:rPr>
+    </w:lvl>
+    <w:lvl w:ilvl="4" w:tentative="1">
+      <w:start w:val="1"/>
+      <w:numFmt w:val="bullet"/>
+      <w:lvlText w:val=""/>
+      <w:lvlJc w:val="left"/>
+      <w:pPr>
+        <w:tabs>
+          <w:tab w:val="num" w:pos="3600"/>
+        </w:tabs>
+        <w:ind w:left="3600" w:hanging="360"/>
+      </w:pPr>
+      <w:rPr>
+        <w:rFonts w:ascii="Wingdings" w:hAnsi="Wingdings" w:hint="default"/>
+        <w:sz w:val="20"/>
+      </w:rPr>
+    </w:lvl>
+    <w:lvl w:ilvl="5" w:tentative="1">
+      <w:start w:val="1"/>
+      <w:numFmt w:val="bullet"/>
+      <w:lvlText w:val=""/>
+      <w:lvlJc w:val="left"/>
+      <w:pPr>
+        <w:tabs>
+          <w:tab w:val="num" w:pos="4320"/>
+        </w:tabs>
+        <w:ind w:left="4320" w:hanging="360"/>
+      </w:pPr>
+      <w:rPr>
+        <w:rFonts w:ascii="Wingdings" w:hAnsi="Wingdings" w:hint="default"/>
+        <w:sz w:val="20"/>
+      </w:rPr>
+    </w:lvl>
+    <w:lvl w:ilvl="6" w:tentative="1">
+      <w:start w:val="1"/>
+      <w:numFmt w:val="bullet"/>
+      <w:lvlText w:val=""/>
+      <w:lvlJc w:val="left"/>
+      <w:pPr>
+        <w:tabs>
+          <w:tab w:val="num" w:pos="5040"/>
+        </w:tabs>
+        <w:ind w:left="5040" w:hanging="360"/>
+      </w:pPr>
+      <w:rPr>
+        <w:rFonts w:ascii="Wingdings" w:hAnsi="Wingdings" w:hint="default"/>
+        <w:sz w:val="20"/>
+      </w:rPr>
+    </w:lvl>
+    <w:lvl w:ilvl="7" w:tentative="1">
+      <w:start w:val="1"/>
+      <w:numFmt w:val="bullet"/>
+      <w:lvlText w:val=""/>
+      <w:lvlJc w:val="left"/>
+      <w:pPr>
+        <w:tabs>
+          <w:tab w:val="num" w:pos="5760"/>
+        </w:tabs>
+        <w:ind w:left="5760" w:hanging="360"/>
+      </w:pPr>
+      <w:rPr>
+        <w:rFonts w:ascii="Wingdings" w:hAnsi="Wingdings" w:hint="default"/>
+        <w:sz w:val="20"/>
+      </w:rPr>
+    </w:lvl>
+    <w:lvl w:ilvl="8" w:tentative="1">
+      <w:start w:val="1"/>
+      <w:numFmt w:val="bullet"/>
+      <w:lvlText w:val=""/>
+      <w:lvlJc w:val="left"/>
+      <w:pPr>
+        <w:tabs>
+          <w:tab w:val="num" w:pos="6480"/>
+        </w:tabs>
+        <w:ind w:left="6480" w:hanging="360"/>
+      </w:pPr>
+      <w:rPr>
+        <w:rFonts w:ascii="Wingdings" w:hAnsi="Wingdings" w:hint="default"/>
+        <w:sz w:val="20"/>
+      </w:rPr>
+    </w:lvl>
+  </w:abstractNum>
+  <w:abstractNum w:abstractNumId="17" w15:restartNumberingAfterBreak="0">
+    <w:nsid w:val="504E12EE"/>
+    <w:multiLevelType w:val="multilevel"/>
+    <w:tmpl w:val="946427F0"/>
+    <w:lvl w:ilvl="0">
+      <w:start w:val="1"/>
+      <w:numFmt w:val="decimal"/>
+      <w:lvlText w:val="%1."/>
+      <w:lvlJc w:val="left"/>
+      <w:pPr>
+        <w:tabs>
+          <w:tab w:val="num" w:pos="720"/>
+        </w:tabs>
+        <w:ind w:left="720" w:hanging="360"/>
+      </w:pPr>
+    </w:lvl>
+    <w:lvl w:ilvl="1" w:tentative="1">
+      <w:start w:val="1"/>
+      <w:numFmt w:val="decimal"/>
+      <w:lvlText w:val="%2."/>
+      <w:lvlJc w:val="left"/>
+      <w:pPr>
+        <w:tabs>
+          <w:tab w:val="num" w:pos="1440"/>
+        </w:tabs>
+        <w:ind w:left="1440" w:hanging="360"/>
+      </w:pPr>
+    </w:lvl>
+    <w:lvl w:ilvl="2" w:tentative="1">
+      <w:start w:val="1"/>
+      <w:numFmt w:val="decimal"/>
+      <w:lvlText w:val="%3."/>
+      <w:lvlJc w:val="left"/>
+      <w:pPr>
+        <w:tabs>
+          <w:tab w:val="num" w:pos="2160"/>
+        </w:tabs>
+        <w:ind w:left="2160" w:hanging="360"/>
+      </w:pPr>
+    </w:lvl>
+    <w:lvl w:ilvl="3" w:tentative="1">
+      <w:start w:val="1"/>
+      <w:numFmt w:val="decimal"/>
+      <w:lvlText w:val="%4."/>
+      <w:lvlJc w:val="left"/>
+      <w:pPr>
+        <w:tabs>
+          <w:tab w:val="num" w:pos="2880"/>
+        </w:tabs>
+        <w:ind w:left="2880" w:hanging="360"/>
+      </w:pPr>
+    </w:lvl>
+    <w:lvl w:ilvl="4" w:tentative="1">
+      <w:start w:val="1"/>
+      <w:numFmt w:val="decimal"/>
+      <w:lvlText w:val="%5."/>
+      <w:lvlJc w:val="left"/>
+      <w:pPr>
+        <w:tabs>
+          <w:tab w:val="num" w:pos="3600"/>
+        </w:tabs>
+        <w:ind w:left="3600" w:hanging="360"/>
+      </w:pPr>
+    </w:lvl>
+    <w:lvl w:ilvl="5" w:tentative="1">
+      <w:start w:val="1"/>
+      <w:numFmt w:val="decimal"/>
+      <w:lvlText w:val="%6."/>
+      <w:lvlJc w:val="left"/>
+      <w:pPr>
+        <w:tabs>
+          <w:tab w:val="num" w:pos="4320"/>
+        </w:tabs>
+        <w:ind w:left="4320" w:hanging="360"/>
+      </w:pPr>
+    </w:lvl>
+    <w:lvl w:ilvl="6" w:tentative="1">
+      <w:start w:val="1"/>
+      <w:numFmt w:val="decimal"/>
+      <w:lvlText w:val="%7."/>
+      <w:lvlJc w:val="left"/>
+      <w:pPr>
+        <w:tabs>
+          <w:tab w:val="num" w:pos="5040"/>
+        </w:tabs>
+        <w:ind w:left="5040" w:hanging="360"/>
+      </w:pPr>
+    </w:lvl>
+    <w:lvl w:ilvl="7" w:tentative="1">
+      <w:start w:val="1"/>
+      <w:numFmt w:val="decimal"/>
+      <w:lvlText w:val="%8."/>
+      <w:lvlJc w:val="left"/>
+      <w:pPr>
+        <w:tabs>
+          <w:tab w:val="num" w:pos="5760"/>
+        </w:tabs>
+        <w:ind w:left="5760" w:hanging="360"/>
+      </w:pPr>
+    </w:lvl>
+    <w:lvl w:ilvl="8" w:tentative="1">
+      <w:start w:val="1"/>
+      <w:numFmt w:val="decimal"/>
+      <w:lvlText w:val="%9."/>
+      <w:lvlJc w:val="left"/>
+      <w:pPr>
+        <w:tabs>
+          <w:tab w:val="num" w:pos="6480"/>
+        </w:tabs>
+        <w:ind w:left="6480" w:hanging="360"/>
+      </w:pPr>
+    </w:lvl>
+  </w:abstractNum>
+  <w:abstractNum w:abstractNumId="18" w15:restartNumberingAfterBreak="0">
     <w:nsid w:val="5BD550DD"/>
     <w:multiLevelType w:val="hybridMultilevel"/>
     <w:tmpl w:val="8A9E4938"/>
@@ -5035,7 +6379,7 @@
       </w:pPr>
     </w:lvl>
   </w:abstractNum>
-  <w:abstractNum w:abstractNumId="13" w15:restartNumberingAfterBreak="0">
+  <w:abstractNum w:abstractNumId="19" w15:restartNumberingAfterBreak="0">
     <w:nsid w:val="5E2047A1"/>
     <w:multiLevelType w:val="hybridMultilevel"/>
     <w:tmpl w:val="D8B2AB48"/>
@@ -5148,7 +6492,156 @@
       </w:rPr>
     </w:lvl>
   </w:abstractNum>
-  <w:abstractNum w:abstractNumId="14" w15:restartNumberingAfterBreak="0">
+  <w:abstractNum w:abstractNumId="20" w15:restartNumberingAfterBreak="0">
+    <w:nsid w:val="62647018"/>
+    <w:multiLevelType w:val="multilevel"/>
+    <w:tmpl w:val="303AAF9E"/>
+    <w:lvl w:ilvl="0">
+      <w:start w:val="1"/>
+      <w:numFmt w:val="bullet"/>
+      <w:lvlText w:val=""/>
+      <w:lvlJc w:val="left"/>
+      <w:pPr>
+        <w:tabs>
+          <w:tab w:val="num" w:pos="720"/>
+        </w:tabs>
+        <w:ind w:left="720" w:hanging="360"/>
+      </w:pPr>
+      <w:rPr>
+        <w:rFonts w:ascii="Symbol" w:hAnsi="Symbol" w:hint="default"/>
+        <w:sz w:val="20"/>
+      </w:rPr>
+    </w:lvl>
+    <w:lvl w:ilvl="1" w:tentative="1">
+      <w:start w:val="1"/>
+      <w:numFmt w:val="bullet"/>
+      <w:lvlText w:val="o"/>
+      <w:lvlJc w:val="left"/>
+      <w:pPr>
+        <w:tabs>
+          <w:tab w:val="num" w:pos="1440"/>
+        </w:tabs>
+        <w:ind w:left="1440" w:hanging="360"/>
+      </w:pPr>
+      <w:rPr>
+        <w:rFonts w:ascii="Courier New" w:hAnsi="Courier New" w:hint="default"/>
+        <w:sz w:val="20"/>
+      </w:rPr>
+    </w:lvl>
+    <w:lvl w:ilvl="2" w:tentative="1">
+      <w:start w:val="1"/>
+      <w:numFmt w:val="bullet"/>
+      <w:lvlText w:val=""/>
+      <w:lvlJc w:val="left"/>
+      <w:pPr>
+        <w:tabs>
+          <w:tab w:val="num" w:pos="2160"/>
+        </w:tabs>
+        <w:ind w:left="2160" w:hanging="360"/>
+      </w:pPr>
+      <w:rPr>
+        <w:rFonts w:ascii="Wingdings" w:hAnsi="Wingdings" w:hint="default"/>
+        <w:sz w:val="20"/>
+      </w:rPr>
+    </w:lvl>
+    <w:lvl w:ilvl="3" w:tentative="1">
+      <w:start w:val="1"/>
+      <w:numFmt w:val="bullet"/>
+      <w:lvlText w:val=""/>
+      <w:lvlJc w:val="left"/>
+      <w:pPr>
+        <w:tabs>
+          <w:tab w:val="num" w:pos="2880"/>
+        </w:tabs>
+        <w:ind w:left="2880" w:hanging="360"/>
+      </w:pPr>
+      <w:rPr>
+        <w:rFonts w:ascii="Wingdings" w:hAnsi="Wingdings" w:hint="default"/>
+        <w:sz w:val="20"/>
+      </w:rPr>
+    </w:lvl>
+    <w:lvl w:ilvl="4" w:tentative="1">
+      <w:start w:val="1"/>
+      <w:numFmt w:val="bullet"/>
+      <w:lvlText w:val=""/>
+      <w:lvlJc w:val="left"/>
+      <w:pPr>
+        <w:tabs>
+          <w:tab w:val="num" w:pos="3600"/>
+        </w:tabs>
+        <w:ind w:left="3600" w:hanging="360"/>
+      </w:pPr>
+      <w:rPr>
+        <w:rFonts w:ascii="Wingdings" w:hAnsi="Wingdings" w:hint="default"/>
+        <w:sz w:val="20"/>
+      </w:rPr>
+    </w:lvl>
+    <w:lvl w:ilvl="5" w:tentative="1">
+      <w:start w:val="1"/>
+      <w:numFmt w:val="bullet"/>
+      <w:lvlText w:val=""/>
+      <w:lvlJc w:val="left"/>
+      <w:pPr>
+        <w:tabs>
+          <w:tab w:val="num" w:pos="4320"/>
+        </w:tabs>
+        <w:ind w:left="4320" w:hanging="360"/>
+      </w:pPr>
+      <w:rPr>
+        <w:rFonts w:ascii="Wingdings" w:hAnsi="Wingdings" w:hint="default"/>
+        <w:sz w:val="20"/>
+      </w:rPr>
+    </w:lvl>
+    <w:lvl w:ilvl="6" w:tentative="1">
+      <w:start w:val="1"/>
+      <w:numFmt w:val="bullet"/>
+      <w:lvlText w:val=""/>
+      <w:lvlJc w:val="left"/>
+      <w:pPr>
+        <w:tabs>
+          <w:tab w:val="num" w:pos="5040"/>
+        </w:tabs>
+        <w:ind w:left="5040" w:hanging="360"/>
+      </w:pPr>
+      <w:rPr>
+        <w:rFonts w:ascii="Wingdings" w:hAnsi="Wingdings" w:hint="default"/>
+        <w:sz w:val="20"/>
+      </w:rPr>
+    </w:lvl>
+    <w:lvl w:ilvl="7" w:tentative="1">
+      <w:start w:val="1"/>
+      <w:numFmt w:val="bullet"/>
+      <w:lvlText w:val=""/>
+      <w:lvlJc w:val="left"/>
+      <w:pPr>
+        <w:tabs>
+          <w:tab w:val="num" w:pos="5760"/>
+        </w:tabs>
+        <w:ind w:left="5760" w:hanging="360"/>
+      </w:pPr>
+      <w:rPr>
+        <w:rFonts w:ascii="Wingdings" w:hAnsi="Wingdings" w:hint="default"/>
+        <w:sz w:val="20"/>
+      </w:rPr>
+    </w:lvl>
+    <w:lvl w:ilvl="8" w:tentative="1">
+      <w:start w:val="1"/>
+      <w:numFmt w:val="bullet"/>
+      <w:lvlText w:val=""/>
+      <w:lvlJc w:val="left"/>
+      <w:pPr>
+        <w:tabs>
+          <w:tab w:val="num" w:pos="6480"/>
+        </w:tabs>
+        <w:ind w:left="6480" w:hanging="360"/>
+      </w:pPr>
+      <w:rPr>
+        <w:rFonts w:ascii="Wingdings" w:hAnsi="Wingdings" w:hint="default"/>
+        <w:sz w:val="20"/>
+      </w:rPr>
+    </w:lvl>
+  </w:abstractNum>
+  <w:abstractNum w:abstractNumId="21" w15:restartNumberingAfterBreak="0">
     <w:nsid w:val="628E1C99"/>
     <w:multiLevelType w:val="multilevel"/>
     <w:tmpl w:val="8A14C338"/>
@@ -5261,7 +6754,7 @@
       </w:rPr>
     </w:lvl>
   </w:abstractNum>
-  <w:abstractNum w:abstractNumId="15" w15:restartNumberingAfterBreak="0">
+  <w:abstractNum w:abstractNumId="22" w15:restartNumberingAfterBreak="0">
     <w:nsid w:val="6A865904"/>
     <w:multiLevelType w:val="multilevel"/>
     <w:tmpl w:val="63B0D6E8"/>
@@ -5360,7 +6853,7 @@
       </w:pPr>
     </w:lvl>
   </w:abstractNum>
-  <w:abstractNum w:abstractNumId="16" w15:restartNumberingAfterBreak="0">
+  <w:abstractNum w:abstractNumId="23" w15:restartNumberingAfterBreak="0">
     <w:nsid w:val="6BF6108F"/>
     <w:multiLevelType w:val="hybridMultilevel"/>
     <w:tmpl w:val="CAFA90B4"/>
@@ -5474,7 +6967,7 @@
       </w:pPr>
     </w:lvl>
   </w:abstractNum>
-  <w:abstractNum w:abstractNumId="17" w15:restartNumberingAfterBreak="0">
+  <w:abstractNum w:abstractNumId="24" w15:restartNumberingAfterBreak="0">
     <w:nsid w:val="6D9549E1"/>
     <w:multiLevelType w:val="hybridMultilevel"/>
     <w:tmpl w:val="BB80994A"/>
@@ -5563,7 +7056,7 @@
       </w:pPr>
     </w:lvl>
   </w:abstractNum>
-  <w:abstractNum w:abstractNumId="18" w15:restartNumberingAfterBreak="0">
+  <w:abstractNum w:abstractNumId="25" w15:restartNumberingAfterBreak="0">
     <w:nsid w:val="71F0634F"/>
     <w:multiLevelType w:val="multilevel"/>
     <w:tmpl w:val="59AC9CD2"/>
@@ -5712,10 +7205,155 @@
       </w:rPr>
     </w:lvl>
   </w:abstractNum>
-  <w:abstractNum w:abstractNumId="19" w15:restartNumberingAfterBreak="0">
+  <w:abstractNum w:abstractNumId="26" w15:restartNumberingAfterBreak="0">
     <w:nsid w:val="7A294CA1"/>
     <w:multiLevelType w:val="multilevel"/>
-    <w:tmpl w:val="068440A8"/>
+    <w:tmpl w:val="F34C6158"/>
+    <w:lvl w:ilvl="0">
+      <w:start w:val="1"/>
+      <w:numFmt w:val="bullet"/>
+      <w:lvlText w:val=""/>
+      <w:lvlJc w:val="left"/>
+      <w:pPr>
+        <w:tabs>
+          <w:tab w:val="num" w:pos="720"/>
+        </w:tabs>
+        <w:ind w:left="720" w:hanging="360"/>
+      </w:pPr>
+      <w:rPr>
+        <w:rFonts w:ascii="Symbol" w:hAnsi="Symbol" w:hint="default"/>
+        <w:sz w:val="20"/>
+      </w:rPr>
+    </w:lvl>
+    <w:lvl w:ilvl="1">
+      <w:start w:val="2"/>
+      <w:numFmt w:val="bullet"/>
+      <w:lvlText w:val="-"/>
+      <w:lvlJc w:val="left"/>
+      <w:pPr>
+        <w:ind w:left="1440" w:hanging="360"/>
+      </w:pPr>
+      <w:rPr>
+        <w:rFonts w:ascii="맑은 고딕" w:eastAsia="맑은 고딕" w:hAnsi="맑은 고딕" w:cstheme="minorBidi" w:hint="eastAsia"/>
+      </w:rPr>
+    </w:lvl>
+    <w:lvl w:ilvl="2" w:tentative="1">
+      <w:start w:val="1"/>
+      <w:numFmt w:val="bullet"/>
+      <w:lvlText w:val=""/>
+      <w:lvlJc w:val="left"/>
+      <w:pPr>
+        <w:tabs>
+          <w:tab w:val="num" w:pos="2160"/>
+        </w:tabs>
+        <w:ind w:left="2160" w:hanging="360"/>
+      </w:pPr>
+      <w:rPr>
+        <w:rFonts w:ascii="Wingdings" w:hAnsi="Wingdings" w:hint="default"/>
+        <w:sz w:val="20"/>
+      </w:rPr>
+    </w:lvl>
+    <w:lvl w:ilvl="3" w:tentative="1">
+      <w:start w:val="1"/>
+      <w:numFmt w:val="bullet"/>
+      <w:lvlText w:val=""/>
+      <w:lvlJc w:val="left"/>
+      <w:pPr>
+        <w:tabs>
+          <w:tab w:val="num" w:pos="2880"/>
+        </w:tabs>
+        <w:ind w:left="2880" w:hanging="360"/>
+      </w:pPr>
+      <w:rPr>
+        <w:rFonts w:ascii="Wingdings" w:hAnsi="Wingdings" w:hint="default"/>
+        <w:sz w:val="20"/>
+      </w:rPr>
+    </w:lvl>
+    <w:lvl w:ilvl="4" w:tentative="1">
+      <w:start w:val="1"/>
+      <w:numFmt w:val="bullet"/>
+      <w:lvlText w:val=""/>
+      <w:lvlJc w:val="left"/>
+      <w:pPr>
+        <w:tabs>
+          <w:tab w:val="num" w:pos="3600"/>
+        </w:tabs>
+        <w:ind w:left="3600" w:hanging="360"/>
+      </w:pPr>
+      <w:rPr>
+        <w:rFonts w:ascii="Wingdings" w:hAnsi="Wingdings" w:hint="default"/>
+        <w:sz w:val="20"/>
+      </w:rPr>
+    </w:lvl>
+    <w:lvl w:ilvl="5" w:tentative="1">
+      <w:start w:val="1"/>
+      <w:numFmt w:val="bullet"/>
+      <w:lvlText w:val=""/>
+      <w:lvlJc w:val="left"/>
+      <w:pPr>
+        <w:tabs>
+          <w:tab w:val="num" w:pos="4320"/>
+        </w:tabs>
+        <w:ind w:left="4320" w:hanging="360"/>
+      </w:pPr>
+      <w:rPr>
+        <w:rFonts w:ascii="Wingdings" w:hAnsi="Wingdings" w:hint="default"/>
+        <w:sz w:val="20"/>
+      </w:rPr>
+    </w:lvl>
+    <w:lvl w:ilvl="6" w:tentative="1">
+      <w:start w:val="1"/>
+      <w:numFmt w:val="bullet"/>
+      <w:lvlText w:val=""/>
+      <w:lvlJc w:val="left"/>
+      <w:pPr>
+        <w:tabs>
+          <w:tab w:val="num" w:pos="5040"/>
+        </w:tabs>
+        <w:ind w:left="5040" w:hanging="360"/>
+      </w:pPr>
+      <w:rPr>
+        <w:rFonts w:ascii="Wingdings" w:hAnsi="Wingdings" w:hint="default"/>
+        <w:sz w:val="20"/>
+      </w:rPr>
+    </w:lvl>
+    <w:lvl w:ilvl="7" w:tentative="1">
+      <w:start w:val="1"/>
+      <w:numFmt w:val="bullet"/>
+      <w:lvlText w:val=""/>
+      <w:lvlJc w:val="left"/>
+      <w:pPr>
+        <w:tabs>
+          <w:tab w:val="num" w:pos="5760"/>
+        </w:tabs>
+        <w:ind w:left="5760" w:hanging="360"/>
+      </w:pPr>
+      <w:rPr>
+        <w:rFonts w:ascii="Wingdings" w:hAnsi="Wingdings" w:hint="default"/>
+        <w:sz w:val="20"/>
+      </w:rPr>
+    </w:lvl>
+    <w:lvl w:ilvl="8" w:tentative="1">
+      <w:start w:val="1"/>
+      <w:numFmt w:val="bullet"/>
+      <w:lvlText w:val=""/>
+      <w:lvlJc w:val="left"/>
+      <w:pPr>
+        <w:tabs>
+          <w:tab w:val="num" w:pos="6480"/>
+        </w:tabs>
+        <w:ind w:left="6480" w:hanging="360"/>
+      </w:pPr>
+      <w:rPr>
+        <w:rFonts w:ascii="Wingdings" w:hAnsi="Wingdings" w:hint="default"/>
+        <w:sz w:val="20"/>
+      </w:rPr>
+    </w:lvl>
+  </w:abstractNum>
+  <w:abstractNum w:abstractNumId="27" w15:restartNumberingAfterBreak="0">
+    <w:nsid w:val="7F900CF7"/>
+    <w:multiLevelType w:val="multilevel"/>
+    <w:tmpl w:val="3E024A2A"/>
     <w:lvl w:ilvl="0">
       <w:start w:val="1"/>
       <w:numFmt w:val="bullet"/>
@@ -5862,7 +7500,7 @@
     </w:lvl>
   </w:abstractNum>
   <w:num w:numId="1" w16cid:durableId="1645626480">
-    <w:abstractNumId w:val="1"/>
+    <w:abstractNumId w:val="4"/>
     <w:lvlOverride w:ilvl="0">
       <w:startOverride w:val="1"/>
     </w:lvlOverride>
@@ -5892,7 +7530,7 @@
     </w:lvlOverride>
   </w:num>
   <w:num w:numId="2" w16cid:durableId="1965429628">
-    <w:abstractNumId w:val="10"/>
+    <w:abstractNumId w:val="13"/>
     <w:lvlOverride w:ilvl="0">
       <w:startOverride w:val="1"/>
     </w:lvlOverride>
@@ -5922,7 +7560,7 @@
     </w:lvlOverride>
   </w:num>
   <w:num w:numId="3" w16cid:durableId="820778875">
-    <w:abstractNumId w:val="5"/>
+    <w:abstractNumId w:val="8"/>
     <w:lvlOverride w:ilvl="0">
       <w:startOverride w:val="1"/>
     </w:lvlOverride>
@@ -5952,7 +7590,7 @@
     </w:lvlOverride>
   </w:num>
   <w:num w:numId="4" w16cid:durableId="1039204920">
-    <w:abstractNumId w:val="16"/>
+    <w:abstractNumId w:val="23"/>
     <w:lvlOverride w:ilvl="0"/>
     <w:lvlOverride w:ilvl="1">
       <w:startOverride w:val="1"/>
@@ -5980,7 +7618,7 @@
     </w:lvlOverride>
   </w:num>
   <w:num w:numId="5" w16cid:durableId="2039115465">
-    <w:abstractNumId w:val="9"/>
+    <w:abstractNumId w:val="12"/>
     <w:lvlOverride w:ilvl="0"/>
     <w:lvlOverride w:ilvl="1">
       <w:startOverride w:val="1"/>
@@ -6008,7 +7646,7 @@
     </w:lvlOverride>
   </w:num>
   <w:num w:numId="6" w16cid:durableId="1201749528">
-    <w:abstractNumId w:val="15"/>
+    <w:abstractNumId w:val="22"/>
     <w:lvlOverride w:ilvl="0">
       <w:startOverride w:val="1"/>
     </w:lvlOverride>
@@ -6038,46 +7676,70 @@
     </w:lvlOverride>
   </w:num>
   <w:num w:numId="7" w16cid:durableId="1983391371">
-    <w:abstractNumId w:val="4"/>
+    <w:abstractNumId w:val="7"/>
   </w:num>
   <w:num w:numId="8" w16cid:durableId="1728650145">
+    <w:abstractNumId w:val="26"/>
+  </w:num>
+  <w:num w:numId="9" w16cid:durableId="1415392674">
+    <w:abstractNumId w:val="18"/>
+  </w:num>
+  <w:num w:numId="10" w16cid:durableId="1096288248">
+    <w:abstractNumId w:val="15"/>
+  </w:num>
+  <w:num w:numId="11" w16cid:durableId="1609000700">
+    <w:abstractNumId w:val="25"/>
+  </w:num>
+  <w:num w:numId="12" w16cid:durableId="1594708059">
+    <w:abstractNumId w:val="9"/>
+  </w:num>
+  <w:num w:numId="13" w16cid:durableId="2078742828">
     <w:abstractNumId w:val="19"/>
   </w:num>
-  <w:num w:numId="9" w16cid:durableId="1415392674">
-    <w:abstractNumId w:val="12"/>
+  <w:num w:numId="14" w16cid:durableId="2081828889">
+    <w:abstractNumId w:val="21"/>
   </w:num>
-  <w:num w:numId="10" w16cid:durableId="1096288248">
+  <w:num w:numId="15" w16cid:durableId="2124111272">
+    <w:abstractNumId w:val="10"/>
+  </w:num>
+  <w:num w:numId="16" w16cid:durableId="1764957565">
+    <w:abstractNumId w:val="6"/>
+  </w:num>
+  <w:num w:numId="17" w16cid:durableId="1735664892">
+    <w:abstractNumId w:val="24"/>
+  </w:num>
+  <w:num w:numId="18" w16cid:durableId="982083578">
+    <w:abstractNumId w:val="5"/>
+  </w:num>
+  <w:num w:numId="19" w16cid:durableId="897936802">
+    <w:abstractNumId w:val="1"/>
+  </w:num>
+  <w:num w:numId="20" w16cid:durableId="1126046564">
     <w:abstractNumId w:val="11"/>
   </w:num>
-  <w:num w:numId="11" w16cid:durableId="1609000700">
-    <w:abstractNumId w:val="18"/>
+  <w:num w:numId="21" w16cid:durableId="2062898211">
+    <w:abstractNumId w:val="20"/>
   </w:num>
-  <w:num w:numId="12" w16cid:durableId="1594708059">
-    <w:abstractNumId w:val="6"/>
+  <w:num w:numId="22" w16cid:durableId="281619637">
+    <w:abstractNumId w:val="3"/>
   </w:num>
-  <w:num w:numId="13" w16cid:durableId="2078742828">
-    <w:abstractNumId w:val="13"/>
+  <w:num w:numId="23" w16cid:durableId="137039514">
+    <w:abstractNumId w:val="0"/>
   </w:num>
-  <w:num w:numId="14" w16cid:durableId="2081828889">
+  <w:num w:numId="24" w16cid:durableId="1308706305">
+    <w:abstractNumId w:val="27"/>
+  </w:num>
+  <w:num w:numId="25" w16cid:durableId="1995912945">
+    <w:abstractNumId w:val="16"/>
+  </w:num>
+  <w:num w:numId="26" w16cid:durableId="151990203">
+    <w:abstractNumId w:val="2"/>
+  </w:num>
+  <w:num w:numId="27" w16cid:durableId="110832388">
     <w:abstractNumId w:val="14"/>
   </w:num>
-  <w:num w:numId="15" w16cid:durableId="2124111272">
-    <w:abstractNumId w:val="7"/>
-  </w:num>
-  <w:num w:numId="16" w16cid:durableId="1764957565">
-    <w:abstractNumId w:val="3"/>
-  </w:num>
-  <w:num w:numId="17" w16cid:durableId="1735664892">
+  <w:num w:numId="28" w16cid:durableId="1435133241">
     <w:abstractNumId w:val="17"/>
-  </w:num>
-  <w:num w:numId="18" w16cid:durableId="982083578">
-    <w:abstractNumId w:val="2"/>
-  </w:num>
-  <w:num w:numId="19" w16cid:durableId="897936802">
-    <w:abstractNumId w:val="0"/>
-  </w:num>
-  <w:num w:numId="20" w16cid:durableId="1126046564">
-    <w:abstractNumId w:val="8"/>
   </w:num>
 </w:numbering>
 </file>
@@ -6488,6 +8150,50 @@
       <w:autoSpaceDN w:val="0"/>
     </w:pPr>
   </w:style>
+  <w:style w:type="paragraph" w:styleId="3">
+    <w:name w:val="heading 3"/>
+    <w:basedOn w:val="a"/>
+    <w:next w:val="a"/>
+    <w:link w:val="3Char"/>
+    <w:uiPriority w:val="9"/>
+    <w:semiHidden/>
+    <w:unhideWhenUsed/>
+    <w:qFormat/>
+    <w:rsid w:val="005C2678"/>
+    <w:pPr>
+      <w:keepNext/>
+      <w:ind w:leftChars="300" w:left="300" w:hangingChars="200" w:hanging="2000"/>
+      <w:outlineLvl w:val="2"/>
+    </w:pPr>
+    <w:rPr>
+      <w:rFonts w:asciiTheme="majorHAnsi" w:eastAsiaTheme="majorEastAsia" w:hAnsiTheme="majorHAnsi" w:cstheme="majorBidi"/>
+    </w:rPr>
+  </w:style>
+  <w:style w:type="paragraph" w:styleId="4">
+    <w:name w:val="heading 4"/>
+    <w:basedOn w:val="a"/>
+    <w:link w:val="4Char"/>
+    <w:uiPriority w:val="9"/>
+    <w:qFormat/>
+    <w:rsid w:val="005C2678"/>
+    <w:pPr>
+      <w:widowControl/>
+      <w:wordWrap/>
+      <w:autoSpaceDE/>
+      <w:autoSpaceDN/>
+      <w:spacing w:before="100" w:beforeAutospacing="1" w:after="100" w:afterAutospacing="1" w:line="240" w:lineRule="auto"/>
+      <w:jc w:val="left"/>
+      <w:outlineLvl w:val="3"/>
+    </w:pPr>
+    <w:rPr>
+      <w:rFonts w:ascii="굴림" w:eastAsia="굴림" w:hAnsi="굴림" w:cs="굴림"/>
+      <w:b/>
+      <w:bCs/>
+      <w:kern w:val="0"/>
+      <w:sz w:val="24"/>
+      <w:szCs w:val="24"/>
+    </w:rPr>
+  </w:style>
   <w:style w:type="character" w:default="1" w:styleId="a0">
     <w:name w:val="Default Paragraph Font"/>
     <w:uiPriority w:val="1"/>
@@ -6523,6 +8229,65 @@
     <w:pPr>
       <w:ind w:leftChars="400" w:left="800"/>
     </w:pPr>
+  </w:style>
+  <w:style w:type="character" w:customStyle="1" w:styleId="4Char">
+    <w:name w:val="제목 4 Char"/>
+    <w:basedOn w:val="a0"/>
+    <w:link w:val="4"/>
+    <w:uiPriority w:val="9"/>
+    <w:rsid w:val="005C2678"/>
+    <w:rPr>
+      <w:rFonts w:ascii="굴림" w:eastAsia="굴림" w:hAnsi="굴림" w:cs="굴림"/>
+      <w:b/>
+      <w:bCs/>
+      <w:kern w:val="0"/>
+      <w:sz w:val="24"/>
+      <w:szCs w:val="24"/>
+    </w:rPr>
+  </w:style>
+  <w:style w:type="character" w:styleId="a4">
+    <w:name w:val="Strong"/>
+    <w:basedOn w:val="a0"/>
+    <w:uiPriority w:val="22"/>
+    <w:qFormat/>
+    <w:rsid w:val="005C2678"/>
+    <w:rPr>
+      <w:b/>
+      <w:bCs/>
+    </w:rPr>
+  </w:style>
+  <w:style w:type="paragraph" w:styleId="a5">
+    <w:name w:val="Normal (Web)"/>
+    <w:basedOn w:val="a"/>
+    <w:uiPriority w:val="99"/>
+    <w:semiHidden/>
+    <w:unhideWhenUsed/>
+    <w:rsid w:val="005C2678"/>
+    <w:pPr>
+      <w:widowControl/>
+      <w:wordWrap/>
+      <w:autoSpaceDE/>
+      <w:autoSpaceDN/>
+      <w:spacing w:before="100" w:beforeAutospacing="1" w:after="100" w:afterAutospacing="1" w:line="240" w:lineRule="auto"/>
+      <w:jc w:val="left"/>
+    </w:pPr>
+    <w:rPr>
+      <w:rFonts w:ascii="굴림" w:eastAsia="굴림" w:hAnsi="굴림" w:cs="굴림"/>
+      <w:kern w:val="0"/>
+      <w:sz w:val="24"/>
+      <w:szCs w:val="24"/>
+    </w:rPr>
+  </w:style>
+  <w:style w:type="character" w:customStyle="1" w:styleId="3Char">
+    <w:name w:val="제목 3 Char"/>
+    <w:basedOn w:val="a0"/>
+    <w:link w:val="3"/>
+    <w:uiPriority w:val="9"/>
+    <w:semiHidden/>
+    <w:rsid w:val="005C2678"/>
+    <w:rPr>
+      <w:rFonts w:asciiTheme="majorHAnsi" w:eastAsiaTheme="majorEastAsia" w:hAnsiTheme="majorHAnsi" w:cstheme="majorBidi"/>
+    </w:rPr>
   </w:style>
 </w:styles>
 </file>

</xml_diff>